<commit_message>
docs: add final submission Word doc and PDF with embedded diagrams and candidate credentials
</commit_message>
<xml_diff>
--- a/Fundsroom_Full_Stack_Case_Study_Solution.docx
+++ b/Fundsroom_Full_Stack_Case_Study_Solution.docx
@@ -4,46 +4,253 @@
   <w:body>
     <w:p>
       <w:pPr>
-        <w:spacing w:before="200" w:after="40"/>
+        <w:spacing w:after="20"/>
         <w:jc w:val="center"/>
       </w:pPr>
       <w:r>
         <w:rPr>
           <w:rFonts w:ascii="Calibri" w:hAnsi="Calibri"/>
           <w:b/>
-          <w:color w:val="65756D"/>
-          <w:sz w:val="22"/>
+          <w:color w:val="64746D"/>
+          <w:sz w:val="20"/>
         </w:rPr>
         <w:t>FUNDSROOM RECRUITMENT — ROUND 1 TECHNICAL CASE STUDY</w:t>
-        <w:br/>
       </w:r>
+    </w:p>
+    <w:p>
+      <w:pPr>
+        <w:spacing w:after="80"/>
+        <w:jc w:val="center"/>
+      </w:pPr>
       <w:r>
         <w:rPr>
           <w:rFonts w:ascii="Calibri" w:hAnsi="Calibri"/>
           <w:b/>
           <w:color w:val="102A22"/>
-          <w:sz w:val="40"/>
+          <w:sz w:val="36"/>
         </w:rPr>
         <w:t>Mini ERP + CRM Operations Portal</w:t>
         <w:br/>
-        <w:t>Full-Stack Technical Solution &amp; Architecture Document</w:t>
+        <w:t>Full-Stack Technical Solution &amp; Architecture Report</w:t>
       </w:r>
     </w:p>
-    <w:p>
-      <w:pPr>
-        <w:spacing w:after="320"/>
+    <w:tbl>
+      <w:tblPr>
+        <w:tblW w:type="auto" w:w="0"/>
         <w:jc w:val="center"/>
-      </w:pPr>
-      <w:r>
-        <w:rPr>
-          <w:rFonts w:ascii="Calibri" w:hAnsi="Calibri"/>
-          <w:i/>
-          <w:color w:val="65756D"/>
-          <w:sz w:val="20"/>
-        </w:rPr>
-        <w:t>Position: Full Stack Developer | Location: Pune, Maharashtra | Role: Immediate Joining</w:t>
-      </w:r>
-    </w:p>
+        <w:tblLook w:firstColumn="1" w:firstRow="1" w:lastColumn="0" w:lastRow="0" w:noHBand="0" w:noVBand="1" w:val="04A0"/>
+      </w:tblPr>
+      <w:tblGrid>
+        <w:gridCol w:w="5040"/>
+        <w:gridCol w:w="5040"/>
+      </w:tblGrid>
+      <w:tr>
+        <w:tc>
+          <w:tcPr>
+            <w:tcW w:type="dxa" w:w="5040"/>
+            <w:vAlign w:val="center"/>
+            <w:shd w:fill="F0F4F2"/>
+          </w:tcPr>
+          <w:p>
+            <w:pPr>
+              <w:spacing w:after="40" w:before="40"/>
+            </w:pPr>
+            <w:r>
+              <w:rPr>
+                <w:b/>
+                <w:color w:val="102A22"/>
+                <w:sz w:val="19"/>
+              </w:rPr>
+              <w:t>Candidate Name:</w:t>
+            </w:r>
+          </w:p>
+        </w:tc>
+        <w:tc>
+          <w:tcPr>
+            <w:tcW w:type="dxa" w:w="5040"/>
+            <w:vAlign w:val="center"/>
+            <w:shd w:fill="FFFFFF"/>
+          </w:tcPr>
+          <w:p>
+            <w:pPr>
+              <w:spacing w:after="40" w:before="40"/>
+            </w:pPr>
+            <w:r>
+              <w:rPr>
+                <w:color w:val="17201D"/>
+                <w:sz w:val="19"/>
+              </w:rPr>
+              <w:t>Mahesh B K</w:t>
+            </w:r>
+          </w:p>
+        </w:tc>
+      </w:tr>
+      <w:tr>
+        <w:tc>
+          <w:tcPr>
+            <w:tcW w:type="dxa" w:w="5040"/>
+            <w:vAlign w:val="center"/>
+            <w:shd w:fill="F0F4F2"/>
+          </w:tcPr>
+          <w:p>
+            <w:pPr>
+              <w:spacing w:after="40" w:before="40"/>
+            </w:pPr>
+            <w:r>
+              <w:rPr>
+                <w:b/>
+                <w:color w:val="102A22"/>
+                <w:sz w:val="19"/>
+              </w:rPr>
+              <w:t>University Roll Number:</w:t>
+            </w:r>
+          </w:p>
+        </w:tc>
+        <w:tc>
+          <w:tcPr>
+            <w:tcW w:type="dxa" w:w="5040"/>
+            <w:vAlign w:val="center"/>
+            <w:shd w:fill="FFFFFF"/>
+          </w:tcPr>
+          <w:p>
+            <w:pPr>
+              <w:spacing w:after="40" w:before="40"/>
+            </w:pPr>
+            <w:r>
+              <w:rPr>
+                <w:color w:val="17201D"/>
+                <w:sz w:val="19"/>
+              </w:rPr>
+              <w:t>2023006427</w:t>
+            </w:r>
+          </w:p>
+        </w:tc>
+      </w:tr>
+      <w:tr>
+        <w:tc>
+          <w:tcPr>
+            <w:tcW w:type="dxa" w:w="5040"/>
+            <w:vAlign w:val="center"/>
+            <w:shd w:fill="F0F4F2"/>
+          </w:tcPr>
+          <w:p>
+            <w:pPr>
+              <w:spacing w:after="40" w:before="40"/>
+            </w:pPr>
+            <w:r>
+              <w:rPr>
+                <w:b/>
+                <w:color w:val="102A22"/>
+                <w:sz w:val="19"/>
+              </w:rPr>
+              <w:t>GITAM Official Email ID:</w:t>
+            </w:r>
+          </w:p>
+        </w:tc>
+        <w:tc>
+          <w:tcPr>
+            <w:tcW w:type="dxa" w:w="5040"/>
+            <w:vAlign w:val="center"/>
+            <w:shd w:fill="FFFFFF"/>
+          </w:tcPr>
+          <w:p>
+            <w:pPr>
+              <w:spacing w:after="40" w:before="40"/>
+            </w:pPr>
+            <w:r>
+              <w:rPr>
+                <w:color w:val="17201D"/>
+                <w:sz w:val="19"/>
+              </w:rPr>
+              <w:t>mbk@gitam.in</w:t>
+            </w:r>
+          </w:p>
+        </w:tc>
+      </w:tr>
+      <w:tr>
+        <w:tc>
+          <w:tcPr>
+            <w:tcW w:type="dxa" w:w="5040"/>
+            <w:vAlign w:val="center"/>
+            <w:shd w:fill="F0F4F2"/>
+          </w:tcPr>
+          <w:p>
+            <w:pPr>
+              <w:spacing w:after="40" w:before="40"/>
+            </w:pPr>
+            <w:r>
+              <w:rPr>
+                <w:b/>
+                <w:color w:val="102A22"/>
+                <w:sz w:val="19"/>
+              </w:rPr>
+              <w:t>Personal Email ID:</w:t>
+            </w:r>
+          </w:p>
+        </w:tc>
+        <w:tc>
+          <w:tcPr>
+            <w:tcW w:type="dxa" w:w="5040"/>
+            <w:vAlign w:val="center"/>
+            <w:shd w:fill="FFFFFF"/>
+          </w:tcPr>
+          <w:p>
+            <w:pPr>
+              <w:spacing w:after="40" w:before="40"/>
+            </w:pPr>
+            <w:r>
+              <w:rPr>
+                <w:color w:val="17201D"/>
+                <w:sz w:val="19"/>
+              </w:rPr>
+              <w:t>maheshbk1805@gmail.com</w:t>
+            </w:r>
+          </w:p>
+        </w:tc>
+      </w:tr>
+      <w:tr>
+        <w:tc>
+          <w:tcPr>
+            <w:tcW w:type="dxa" w:w="5040"/>
+            <w:vAlign w:val="center"/>
+            <w:shd w:fill="F0F4F2"/>
+          </w:tcPr>
+          <w:p>
+            <w:pPr>
+              <w:spacing w:after="40" w:before="40"/>
+            </w:pPr>
+            <w:r>
+              <w:rPr>
+                <w:b/>
+                <w:color w:val="102A22"/>
+                <w:sz w:val="19"/>
+              </w:rPr>
+              <w:t>GitHub Repository URL:</w:t>
+            </w:r>
+          </w:p>
+        </w:tc>
+        <w:tc>
+          <w:tcPr>
+            <w:tcW w:type="dxa" w:w="5040"/>
+            <w:vAlign w:val="center"/>
+            <w:shd w:fill="FFFFFF"/>
+          </w:tcPr>
+          <w:p>
+            <w:pPr>
+              <w:spacing w:after="40" w:before="40"/>
+            </w:pPr>
+            <w:r>
+              <w:rPr>
+                <w:b/>
+                <w:color w:val="196F50"/>
+                <w:sz w:val="19"/>
+              </w:rPr>
+              <w:t>https://github.com/maheshbk1805-web/fundsroom-mini-erp-crm</w:t>
+            </w:r>
+          </w:p>
+        </w:tc>
+      </w:tr>
+    </w:tbl>
     <w:p>
       <w:pPr>
         <w:spacing w:after="120"/>
@@ -52,16 +259,16 @@
     <w:p>
       <w:pPr>
         <w:keepNext/>
-        <w:spacing w:before="280" w:after="120"/>
+        <w:spacing w:before="280" w:after="100"/>
       </w:pPr>
       <w:r>
         <w:rPr>
           <w:rFonts w:ascii="Calibri" w:hAnsi="Calibri"/>
           <w:b/>
           <w:color w:val="102A22"/>
-          <w:sz w:val="32"/>
+          <w:sz w:val="30"/>
         </w:rPr>
-        <w:t>1. Executive Summary &amp; Overview</w:t>
+        <w:t>1. Executive Summary &amp; Business Context</w:t>
       </w:r>
     </w:p>
     <w:p>
@@ -72,9 +279,9 @@
         <w:rPr>
           <w:rFonts w:ascii="Calibri" w:hAnsi="Calibri"/>
           <w:color w:val="17201D"/>
-          <w:sz w:val="21"/>
+          <w:sz w:val="20"/>
         </w:rPr>
-        <w:t>This document presents the comprehensive, production-ready solution for the Fundsroom Full Stack Developer Case Study. The project is an operational Mini ERP and CRM Portal engineered specifically for a wholesale and distribution enterprise. The system coordinates customer relationship lifecycles, catalog inventory with intelligent low-stock triggers, tamper-evident stock movement audit logs, and transactional sales delivery challans.</w:t>
+        <w:t>This document presents the complete engineering solution for the Fundsroom Full Stack Developer Case Study: a production-grade Mini ERP + CRM Operations Portal developed for a wholesale distribution enterprise. The enterprise model requires coordinating client acquisition, catalog inventory with alert thresholds, tamper-evident stock movement logs, and sales delivery challans.</w:t>
       </w:r>
     </w:p>
     <w:p>
@@ -85,1100 +292,9 @@
         <w:rPr>
           <w:rFonts w:ascii="Calibri" w:hAnsi="Calibri"/>
           <w:color w:val="17201D"/>
-          <w:sz w:val="21"/>
-        </w:rPr>
-        <w:t>The implementation adheres strictly to the required modern web architecture: a high-performance React + TypeScript SPA on the client, an Express.js + TypeScript RESTful API on the backend, and a robust PostgreSQL database engine ensuring ACID guarantees.</w:t>
-      </w:r>
-    </w:p>
-    <w:p>
-      <w:pPr>
-        <w:keepNext/>
-        <w:spacing w:before="280" w:after="120"/>
-      </w:pPr>
-      <w:r>
-        <w:rPr>
-          <w:rFonts w:ascii="Calibri" w:hAnsi="Calibri"/>
-          <w:b/>
-          <w:color w:val="102A22"/>
-          <w:sz w:val="32"/>
-        </w:rPr>
-        <w:t>2. Technical Stack Architecture</w:t>
-      </w:r>
-    </w:p>
-    <w:tbl>
-      <w:tblPr>
-        <w:tblW w:type="auto" w:w="0"/>
-        <w:jc w:val="center"/>
-        <w:tblLook w:firstColumn="1" w:firstRow="1" w:lastColumn="0" w:lastRow="0" w:noHBand="0" w:noVBand="1" w:val="04A0"/>
-      </w:tblPr>
-      <w:tblGrid>
-        <w:gridCol w:w="3312"/>
-        <w:gridCol w:w="3312"/>
-        <w:gridCol w:w="3312"/>
-      </w:tblGrid>
-      <w:tr>
-        <w:tc>
-          <w:tcPr>
-            <w:tcW w:type="dxa" w:w="3312"/>
-            <w:shd w:fill="102A22"/>
-          </w:tcPr>
-          <w:p>
-            <w:r>
-              <w:rPr>
-                <w:b/>
-                <w:color w:val="FFFFFF"/>
-                <w:sz w:val="19"/>
-              </w:rPr>
-              <w:t>Tier / Component</w:t>
-            </w:r>
-          </w:p>
-        </w:tc>
-        <w:tc>
-          <w:tcPr>
-            <w:tcW w:type="dxa" w:w="3312"/>
-            <w:shd w:fill="102A22"/>
-          </w:tcPr>
-          <w:p>
-            <w:r>
-              <w:rPr>
-                <w:b/>
-                <w:color w:val="FFFFFF"/>
-                <w:sz w:val="19"/>
-              </w:rPr>
-              <w:t>Technology Chosen</w:t>
-            </w:r>
-          </w:p>
-        </w:tc>
-        <w:tc>
-          <w:tcPr>
-            <w:tcW w:type="dxa" w:w="3312"/>
-            <w:shd w:fill="102A22"/>
-          </w:tcPr>
-          <w:p>
-            <w:r>
-              <w:rPr>
-                <w:b/>
-                <w:color w:val="FFFFFF"/>
-                <w:sz w:val="19"/>
-              </w:rPr>
-              <w:t>Justification &amp; Architectural Role</w:t>
-            </w:r>
-          </w:p>
-        </w:tc>
-      </w:tr>
-      <w:tr>
-        <w:tc>
-          <w:tcPr>
-            <w:tcW w:type="dxa" w:w="3312"/>
-          </w:tcPr>
-          <w:p>
-            <w:r>
-              <w:rPr>
-                <w:color w:val="17201D"/>
-                <w:sz w:val="18"/>
-              </w:rPr>
-              <w:t>Frontend Client</w:t>
-            </w:r>
-          </w:p>
-        </w:tc>
-        <w:tc>
-          <w:tcPr>
-            <w:tcW w:type="dxa" w:w="3312"/>
-          </w:tcPr>
-          <w:p>
-            <w:r>
-              <w:rPr>
-                <w:color w:val="17201D"/>
-                <w:sz w:val="18"/>
-              </w:rPr>
-              <w:t>React 18, TypeScript, Vite</w:t>
-            </w:r>
-          </w:p>
-        </w:tc>
-        <w:tc>
-          <w:tcPr>
-            <w:tcW w:type="dxa" w:w="3312"/>
-          </w:tcPr>
-          <w:p>
-            <w:r>
-              <w:rPr>
-                <w:color w:val="17201D"/>
-                <w:sz w:val="18"/>
-              </w:rPr>
-              <w:t>Type safety, instant HMR, modular component structure, and sub-second bundle compilation.</w:t>
-            </w:r>
-          </w:p>
-        </w:tc>
-      </w:tr>
-      <w:tr>
-        <w:tc>
-          <w:tcPr>
-            <w:tcW w:type="dxa" w:w="3312"/>
-          </w:tcPr>
-          <w:p>
-            <w:r>
-              <w:rPr>
-                <w:color w:val="17201D"/>
-                <w:sz w:val="18"/>
-              </w:rPr>
-              <w:t>UI &amp; Styling</w:t>
-            </w:r>
-          </w:p>
-        </w:tc>
-        <w:tc>
-          <w:tcPr>
-            <w:tcW w:type="dxa" w:w="3312"/>
-          </w:tcPr>
-          <w:p>
-            <w:r>
-              <w:rPr>
-                <w:color w:val="17201D"/>
-                <w:sz w:val="18"/>
-              </w:rPr>
-              <w:t>Custom Responsive CSS, Lucide Icons</w:t>
-            </w:r>
-          </w:p>
-        </w:tc>
-        <w:tc>
-          <w:tcPr>
-            <w:tcW w:type="dxa" w:w="3312"/>
-          </w:tcPr>
-          <w:p>
-            <w:r>
-              <w:rPr>
-                <w:color w:val="17201D"/>
-                <w:sz w:val="18"/>
-              </w:rPr>
-              <w:t>Lightweight, ultra-responsive admin dashboard UI adhering to professional enterprise design guidelines.</w:t>
-            </w:r>
-          </w:p>
-        </w:tc>
-      </w:tr>
-      <w:tr>
-        <w:tc>
-          <w:tcPr>
-            <w:tcW w:type="dxa" w:w="3312"/>
-          </w:tcPr>
-          <w:p>
-            <w:r>
-              <w:rPr>
-                <w:color w:val="17201D"/>
-                <w:sz w:val="18"/>
-              </w:rPr>
-              <w:t>Backend API</w:t>
-            </w:r>
-          </w:p>
-        </w:tc>
-        <w:tc>
-          <w:tcPr>
-            <w:tcW w:type="dxa" w:w="3312"/>
-          </w:tcPr>
-          <w:p>
-            <w:r>
-              <w:rPr>
-                <w:color w:val="17201D"/>
-                <w:sz w:val="18"/>
-              </w:rPr>
-              <w:t>Node.js 22, Express.js, TypeScript</w:t>
-            </w:r>
-          </w:p>
-        </w:tc>
-        <w:tc>
-          <w:tcPr>
-            <w:tcW w:type="dxa" w:w="3312"/>
-          </w:tcPr>
-          <w:p>
-            <w:r>
-              <w:rPr>
-                <w:color w:val="17201D"/>
-                <w:sz w:val="18"/>
-              </w:rPr>
-              <w:t>Scalable asynchronous RESTful service with strict request validation and centralized exception handling.</w:t>
-            </w:r>
-          </w:p>
-        </w:tc>
-      </w:tr>
-      <w:tr>
-        <w:tc>
-          <w:tcPr>
-            <w:tcW w:type="dxa" w:w="3312"/>
-          </w:tcPr>
-          <w:p>
-            <w:r>
-              <w:rPr>
-                <w:color w:val="17201D"/>
-                <w:sz w:val="18"/>
-              </w:rPr>
-              <w:t>Database Tier</w:t>
-            </w:r>
-          </w:p>
-        </w:tc>
-        <w:tc>
-          <w:tcPr>
-            <w:tcW w:type="dxa" w:w="3312"/>
-          </w:tcPr>
-          <w:p>
-            <w:r>
-              <w:rPr>
-                <w:color w:val="17201D"/>
-                <w:sz w:val="18"/>
-              </w:rPr>
-              <w:t>PostgreSQL (Neon Cloud &amp; Docker)</w:t>
-            </w:r>
-          </w:p>
-        </w:tc>
-        <w:tc>
-          <w:tcPr>
-            <w:tcW w:type="dxa" w:w="3312"/>
-          </w:tcPr>
-          <w:p>
-            <w:r>
-              <w:rPr>
-                <w:color w:val="17201D"/>
-                <w:sz w:val="18"/>
-              </w:rPr>
-              <w:t>ACID-compliant relational engine with row-level locking (FOR UPDATE) for zero-race-condition transactions.</w:t>
-            </w:r>
-          </w:p>
-        </w:tc>
-      </w:tr>
-      <w:tr>
-        <w:tc>
-          <w:tcPr>
-            <w:tcW w:type="dxa" w:w="3312"/>
-          </w:tcPr>
-          <w:p>
-            <w:r>
-              <w:rPr>
-                <w:color w:val="17201D"/>
-                <w:sz w:val="18"/>
-              </w:rPr>
-              <w:t>Authentication</w:t>
-            </w:r>
-          </w:p>
-        </w:tc>
-        <w:tc>
-          <w:tcPr>
-            <w:tcW w:type="dxa" w:w="3312"/>
-          </w:tcPr>
-          <w:p>
-            <w:r>
-              <w:rPr>
-                <w:color w:val="17201D"/>
-                <w:sz w:val="18"/>
-              </w:rPr>
-              <w:t>JWT (JSON Web Tokens) &amp; Bcrypt</w:t>
-            </w:r>
-          </w:p>
-        </w:tc>
-        <w:tc>
-          <w:tcPr>
-            <w:tcW w:type="dxa" w:w="3312"/>
-          </w:tcPr>
-          <w:p>
-            <w:r>
-              <w:rPr>
-                <w:color w:val="17201D"/>
-                <w:sz w:val="18"/>
-              </w:rPr>
-              <w:t>Stateless, cryptographic authentication with salted password hashing and role-based route middleware.</w:t>
-            </w:r>
-          </w:p>
-        </w:tc>
-      </w:tr>
-      <w:tr>
-        <w:tc>
-          <w:tcPr>
-            <w:tcW w:type="dxa" w:w="3312"/>
-          </w:tcPr>
-          <w:p>
-            <w:r>
-              <w:rPr>
-                <w:color w:val="17201D"/>
-                <w:sz w:val="18"/>
-              </w:rPr>
-              <w:t>DevOps / Containers</w:t>
-            </w:r>
-          </w:p>
-        </w:tc>
-        <w:tc>
-          <w:tcPr>
-            <w:tcW w:type="dxa" w:w="3312"/>
-          </w:tcPr>
-          <w:p>
-            <w:r>
-              <w:rPr>
-                <w:color w:val="17201D"/>
-                <w:sz w:val="18"/>
-              </w:rPr>
-              <w:t>Docker, Docker Compose, Nginx</w:t>
-            </w:r>
-          </w:p>
-        </w:tc>
-        <w:tc>
-          <w:tcPr>
-            <w:tcW w:type="dxa" w:w="3312"/>
-          </w:tcPr>
-          <w:p>
-            <w:r>
-              <w:rPr>
-                <w:color w:val="17201D"/>
-                <w:sz w:val="18"/>
-              </w:rPr>
-              <w:t>Standardized containerization across database, backend API, and static frontend web server.</w:t>
-            </w:r>
-          </w:p>
-        </w:tc>
-      </w:tr>
-      <w:tr>
-        <w:tc>
-          <w:tcPr>
-            <w:tcW w:type="dxa" w:w="3312"/>
-          </w:tcPr>
-          <w:p>
-            <w:r>
-              <w:rPr>
-                <w:color w:val="17201D"/>
-                <w:sz w:val="18"/>
-              </w:rPr>
-              <w:t>CI / CD Automation</w:t>
-            </w:r>
-          </w:p>
-        </w:tc>
-        <w:tc>
-          <w:tcPr>
-            <w:tcW w:type="dxa" w:w="3312"/>
-          </w:tcPr>
-          <w:p>
-            <w:r>
-              <w:rPr>
-                <w:color w:val="17201D"/>
-                <w:sz w:val="18"/>
-              </w:rPr>
-              <w:t>GitHub Actions</w:t>
-            </w:r>
-          </w:p>
-        </w:tc>
-        <w:tc>
-          <w:tcPr>
-            <w:tcW w:type="dxa" w:w="3312"/>
-          </w:tcPr>
-          <w:p>
-            <w:r>
-              <w:rPr>
-                <w:color w:val="17201D"/>
-                <w:sz w:val="18"/>
-              </w:rPr>
-              <w:t>Automated pipeline validating TypeScript compilation, linting, and production builds on push/PR.</w:t>
-            </w:r>
-          </w:p>
-        </w:tc>
-      </w:tr>
-    </w:tbl>
-    <w:p>
-      <w:pPr>
-        <w:keepNext/>
-        <w:spacing w:before="280" w:after="120"/>
-      </w:pPr>
-      <w:r>
-        <w:rPr>
-          <w:rFonts w:ascii="Calibri" w:hAnsi="Calibri"/>
-          <w:b/>
-          <w:color w:val="102A22"/>
-          <w:sz w:val="32"/>
-        </w:rPr>
-        <w:t>3. Verified Test Login Credentials</w:t>
-      </w:r>
-    </w:p>
-    <w:p>
-      <w:pPr>
-        <w:spacing w:before="40" w:after="80" w:line="276" w:lineRule="auto"/>
-      </w:pPr>
-      <w:r>
-        <w:rPr>
-          <w:rFonts w:ascii="Calibri" w:hAnsi="Calibri"/>
-          <w:color w:val="17201D"/>
-          <w:sz w:val="21"/>
-        </w:rPr>
-        <w:t xml:space="preserve">All accounts are pre-seeded in the database with the uniform password: </w:t>
-      </w:r>
-    </w:p>
-    <w:p>
-      <w:r>
-        <w:rPr>
-          <w:b/>
-          <w:color w:val="196F50"/>
-          <w:sz w:val="22"/>
-        </w:rPr>
-        <w:t>Master Demo Password: Password@123</w:t>
-      </w:r>
-    </w:p>
-    <w:tbl>
-      <w:tblPr>
-        <w:tblW w:type="auto" w:w="0"/>
-        <w:jc w:val="center"/>
-        <w:tblLook w:firstColumn="1" w:firstRow="1" w:lastColumn="0" w:lastRow="0" w:noHBand="0" w:noVBand="1" w:val="04A0"/>
-      </w:tblPr>
-      <w:tblGrid>
-        <w:gridCol w:w="2484"/>
-        <w:gridCol w:w="2484"/>
-        <w:gridCol w:w="2484"/>
-        <w:gridCol w:w="2484"/>
-      </w:tblGrid>
-      <w:tr>
-        <w:tc>
-          <w:tcPr>
-            <w:tcW w:type="dxa" w:w="2484"/>
-            <w:shd w:fill="196F50"/>
-          </w:tcPr>
-          <w:p>
-            <w:r>
-              <w:rPr>
-                <w:b/>
-                <w:color w:val="FFFFFF"/>
-                <w:sz w:val="19"/>
-              </w:rPr>
-              <w:t>Role</w:t>
-            </w:r>
-          </w:p>
-        </w:tc>
-        <w:tc>
-          <w:tcPr>
-            <w:tcW w:type="dxa" w:w="2484"/>
-            <w:shd w:fill="196F50"/>
-          </w:tcPr>
-          <w:p>
-            <w:r>
-              <w:rPr>
-                <w:b/>
-                <w:color w:val="FFFFFF"/>
-                <w:sz w:val="19"/>
-              </w:rPr>
-              <w:t>Login Email</w:t>
-            </w:r>
-          </w:p>
-        </w:tc>
-        <w:tc>
-          <w:tcPr>
-            <w:tcW w:type="dxa" w:w="2484"/>
-            <w:shd w:fill="196F50"/>
-          </w:tcPr>
-          <w:p>
-            <w:r>
-              <w:rPr>
-                <w:b/>
-                <w:color w:val="FFFFFF"/>
-                <w:sz w:val="19"/>
-              </w:rPr>
-              <w:t>Password</w:t>
-            </w:r>
-          </w:p>
-        </w:tc>
-        <w:tc>
-          <w:tcPr>
-            <w:tcW w:type="dxa" w:w="2484"/>
-            <w:shd w:fill="196F50"/>
-          </w:tcPr>
-          <w:p>
-            <w:r>
-              <w:rPr>
-                <w:b/>
-                <w:color w:val="FFFFFF"/>
-                <w:sz w:val="19"/>
-              </w:rPr>
-              <w:t>Module Access &amp; Permissions Scope</w:t>
-            </w:r>
-          </w:p>
-        </w:tc>
-      </w:tr>
-      <w:tr>
-        <w:tc>
-          <w:tcPr>
-            <w:tcW w:type="dxa" w:w="2484"/>
-          </w:tcPr>
-          <w:p>
-            <w:r>
-              <w:rPr>
-                <w:color w:val="17201D"/>
-                <w:sz w:val="18"/>
-              </w:rPr>
-              <w:t>Admin</w:t>
-            </w:r>
-          </w:p>
-        </w:tc>
-        <w:tc>
-          <w:tcPr>
-            <w:tcW w:type="dxa" w:w="2484"/>
-          </w:tcPr>
-          <w:p>
-            <w:r>
-              <w:rPr>
-                <w:color w:val="17201D"/>
-                <w:sz w:val="18"/>
-              </w:rPr>
-              <w:t>admin@fundsroom.local</w:t>
-            </w:r>
-          </w:p>
-        </w:tc>
-        <w:tc>
-          <w:tcPr>
-            <w:tcW w:type="dxa" w:w="2484"/>
-          </w:tcPr>
-          <w:p>
-            <w:r>
-              <w:rPr>
-                <w:color w:val="17201D"/>
-                <w:sz w:val="18"/>
-              </w:rPr>
-              <w:t>Password@123</w:t>
-            </w:r>
-          </w:p>
-        </w:tc>
-        <w:tc>
-          <w:tcPr>
-            <w:tcW w:type="dxa" w:w="2484"/>
-          </w:tcPr>
-          <w:p>
-            <w:r>
-              <w:rPr>
-                <w:color w:val="17201D"/>
-                <w:sz w:val="18"/>
-              </w:rPr>
-              <w:t>Full system access: CRM, Inventory, Stock Movements, Sales Challans, System Analytics.</w:t>
-            </w:r>
-          </w:p>
-        </w:tc>
-      </w:tr>
-      <w:tr>
-        <w:tc>
-          <w:tcPr>
-            <w:tcW w:type="dxa" w:w="2484"/>
-          </w:tcPr>
-          <w:p>
-            <w:r>
-              <w:rPr>
-                <w:color w:val="17201D"/>
-                <w:sz w:val="18"/>
-              </w:rPr>
-              <w:t>Sales</w:t>
-            </w:r>
-          </w:p>
-        </w:tc>
-        <w:tc>
-          <w:tcPr>
-            <w:tcW w:type="dxa" w:w="2484"/>
-          </w:tcPr>
-          <w:p>
-            <w:r>
-              <w:rPr>
-                <w:color w:val="17201D"/>
-                <w:sz w:val="18"/>
-              </w:rPr>
-              <w:t>sales@fundsroom.local</w:t>
-            </w:r>
-          </w:p>
-        </w:tc>
-        <w:tc>
-          <w:tcPr>
-            <w:tcW w:type="dxa" w:w="2484"/>
-          </w:tcPr>
-          <w:p>
-            <w:r>
-              <w:rPr>
-                <w:color w:val="17201D"/>
-                <w:sz w:val="18"/>
-              </w:rPr>
-              <w:t>Password@123</w:t>
-            </w:r>
-          </w:p>
-        </w:tc>
-        <w:tc>
-          <w:tcPr>
-            <w:tcW w:type="dxa" w:w="2484"/>
-          </w:tcPr>
-          <w:p>
-            <w:r>
-              <w:rPr>
-                <w:color w:val="17201D"/>
-                <w:sz w:val="18"/>
-              </w:rPr>
-              <w:t>Sales domain: Create/edit customers, log follow-ups, draft and confirm multi-item sales challans.</w:t>
-            </w:r>
-          </w:p>
-        </w:tc>
-      </w:tr>
-      <w:tr>
-        <w:tc>
-          <w:tcPr>
-            <w:tcW w:type="dxa" w:w="2484"/>
-          </w:tcPr>
-          <w:p>
-            <w:r>
-              <w:rPr>
-                <w:color w:val="17201D"/>
-                <w:sz w:val="18"/>
-              </w:rPr>
-              <w:t>Warehouse</w:t>
-            </w:r>
-          </w:p>
-        </w:tc>
-        <w:tc>
-          <w:tcPr>
-            <w:tcW w:type="dxa" w:w="2484"/>
-          </w:tcPr>
-          <w:p>
-            <w:r>
-              <w:rPr>
-                <w:color w:val="17201D"/>
-                <w:sz w:val="18"/>
-              </w:rPr>
-              <w:t>warehouse@fundsroom.local</w:t>
-            </w:r>
-          </w:p>
-        </w:tc>
-        <w:tc>
-          <w:tcPr>
-            <w:tcW w:type="dxa" w:w="2484"/>
-          </w:tcPr>
-          <w:p>
-            <w:r>
-              <w:rPr>
-                <w:color w:val="17201D"/>
-                <w:sz w:val="18"/>
-              </w:rPr>
-              <w:t>Password@123</w:t>
-            </w:r>
-          </w:p>
-        </w:tc>
-        <w:tc>
-          <w:tcPr>
-            <w:tcW w:type="dxa" w:w="2484"/>
-          </w:tcPr>
-          <w:p>
-            <w:r>
-              <w:rPr>
-                <w:color w:val="17201D"/>
-                <w:sz w:val="18"/>
-              </w:rPr>
-              <w:t>Inventory domain: Create/edit products, manage reorder alerts, record manual stock inward/outward.</w:t>
-            </w:r>
-          </w:p>
-        </w:tc>
-      </w:tr>
-      <w:tr>
-        <w:tc>
-          <w:tcPr>
-            <w:tcW w:type="dxa" w:w="2484"/>
-          </w:tcPr>
-          <w:p>
-            <w:r>
-              <w:rPr>
-                <w:color w:val="17201D"/>
-                <w:sz w:val="18"/>
-              </w:rPr>
-              <w:t>Accounts</w:t>
-            </w:r>
-          </w:p>
-        </w:tc>
-        <w:tc>
-          <w:tcPr>
-            <w:tcW w:type="dxa" w:w="2484"/>
-          </w:tcPr>
-          <w:p>
-            <w:r>
-              <w:rPr>
-                <w:color w:val="17201D"/>
-                <w:sz w:val="18"/>
-              </w:rPr>
-              <w:t>accounts@fundsroom.local</w:t>
-            </w:r>
-          </w:p>
-        </w:tc>
-        <w:tc>
-          <w:tcPr>
-            <w:tcW w:type="dxa" w:w="2484"/>
-          </w:tcPr>
-          <w:p>
-            <w:r>
-              <w:rPr>
-                <w:color w:val="17201D"/>
-                <w:sz w:val="18"/>
-              </w:rPr>
-              <w:t>Password@123</w:t>
-            </w:r>
-          </w:p>
-        </w:tc>
-        <w:tc>
-          <w:tcPr>
-            <w:tcW w:type="dxa" w:w="2484"/>
-          </w:tcPr>
-          <w:p>
-            <w:r>
-              <w:rPr>
-                <w:color w:val="17201D"/>
-                <w:sz w:val="18"/>
-              </w:rPr>
-              <w:t>Auditing domain: Read-only operational visibility, printable tax challans and transaction audit logs.</w:t>
-            </w:r>
-          </w:p>
-        </w:tc>
-      </w:tr>
-    </w:tbl>
-    <w:p>
-      <w:pPr>
-        <w:keepNext/>
-        <w:spacing w:before="280" w:after="120"/>
-      </w:pPr>
-      <w:r>
-        <w:rPr>
-          <w:rFonts w:ascii="Calibri" w:hAnsi="Calibri"/>
-          <w:b/>
-          <w:color w:val="102A22"/>
-          <w:sz w:val="32"/>
-        </w:rPr>
-        <w:t>4. Core Modules Implementation Details</w:t>
-      </w:r>
-    </w:p>
-    <w:p>
-      <w:pPr>
-        <w:keepNext/>
-        <w:spacing w:before="200" w:after="80"/>
-      </w:pPr>
-      <w:r>
-        <w:rPr>
-          <w:rFonts w:ascii="Calibri" w:hAnsi="Calibri"/>
-          <w:b/>
-          <w:color w:val="196F50"/>
-          <w:sz w:val="26"/>
-        </w:rPr>
-        <w:t>Module 1: Authentication &amp; Role-Based Access Control (RBAC)</w:t>
-      </w:r>
-    </w:p>
-    <w:p>
-      <w:pPr>
-        <w:pStyle w:val="ListBullet"/>
-        <w:spacing w:before="20" w:after="40" w:line="276" w:lineRule="auto"/>
-      </w:pPr>
-      <w:r>
-        <w:rPr>
-          <w:rFonts w:ascii="Calibri" w:hAnsi="Calibri"/>
-          <w:color w:val="17201D"/>
           <w:sz w:val="20"/>
         </w:rPr>
-        <w:t>Secured JWT authentication flow with bearer token header transmission.</w:t>
-      </w:r>
-    </w:p>
-    <w:p>
-      <w:pPr>
-        <w:pStyle w:val="ListBullet"/>
-        <w:spacing w:before="20" w:after="40" w:line="276" w:lineRule="auto"/>
-      </w:pPr>
-      <w:r>
-        <w:rPr>
-          <w:rFonts w:ascii="Calibri" w:hAnsi="Calibri"/>
-          <w:color w:val="17201D"/>
-          <w:sz w:val="20"/>
-        </w:rPr>
-        <w:t>Express middleware 'allow(...roles)' rigorously enforces server-side role boundaries.</w:t>
-      </w:r>
-    </w:p>
-    <w:p>
-      <w:pPr>
-        <w:pStyle w:val="ListBullet"/>
-        <w:spacing w:before="20" w:after="40" w:line="276" w:lineRule="auto"/>
-      </w:pPr>
-      <w:r>
-        <w:rPr>
-          <w:rFonts w:ascii="Calibri" w:hAnsi="Calibri"/>
-          <w:color w:val="17201D"/>
-          <w:sz w:val="20"/>
-        </w:rPr>
-        <w:t>Frontend shell dynamically renders role-specific badges, workspace designations, and contextual action controls.</w:t>
-      </w:r>
-    </w:p>
-    <w:p>
-      <w:pPr>
-        <w:keepNext/>
-        <w:spacing w:before="200" w:after="80"/>
-      </w:pPr>
-      <w:r>
-        <w:rPr>
-          <w:rFonts w:ascii="Calibri" w:hAnsi="Calibri"/>
-          <w:b/>
-          <w:color w:val="196F50"/>
-          <w:sz w:val="26"/>
-        </w:rPr>
-        <w:t>Module 2: Customer CRM Management</w:t>
-      </w:r>
-    </w:p>
-    <w:p>
-      <w:pPr>
-        <w:pStyle w:val="ListBullet"/>
-        <w:spacing w:before="20" w:after="40" w:line="276" w:lineRule="auto"/>
-      </w:pPr>
-      <w:r>
-        <w:rPr>
-          <w:rFonts w:ascii="Calibri" w:hAnsi="Calibri"/>
-          <w:color w:val="17201D"/>
-          <w:sz w:val="20"/>
-        </w:rPr>
-        <w:t>Fields tracked: Customer Name, Mobile, Email, Business Name, GST Number (Optional), Customer Type (Retail, Wholesale, Distributor), Address, Status (Lead, Active, Inactive), Follow-up Date, and Notes.</w:t>
-      </w:r>
-    </w:p>
-    <w:p>
-      <w:pPr>
-        <w:pStyle w:val="ListBullet"/>
-        <w:spacing w:before="20" w:after="40" w:line="276" w:lineRule="auto"/>
-      </w:pPr>
-      <w:r>
-        <w:rPr>
-          <w:rFonts w:ascii="Calibri" w:hAnsi="Calibri"/>
-          <w:color w:val="17201D"/>
-          <w:sz w:val="20"/>
-        </w:rPr>
-        <w:t>Real-time search functionality querying customer names and business entities.</w:t>
-      </w:r>
-    </w:p>
-    <w:p>
-      <w:pPr>
-        <w:pStyle w:val="ListBullet"/>
-        <w:spacing w:before="20" w:after="40" w:line="276" w:lineRule="auto"/>
-      </w:pPr>
-      <w:r>
-        <w:rPr>
-          <w:rFonts w:ascii="Calibri" w:hAnsi="Calibri"/>
-          <w:color w:val="17201D"/>
-          <w:sz w:val="20"/>
-        </w:rPr>
-        <w:t>Dedicated Customer Profile Drawer displaying contact records, registered GSTIN, and full history.</w:t>
-      </w:r>
-    </w:p>
-    <w:p>
-      <w:pPr>
-        <w:pStyle w:val="ListBullet"/>
-        <w:spacing w:before="20" w:after="40" w:line="276" w:lineRule="auto"/>
-      </w:pPr>
-      <w:r>
-        <w:rPr>
-          <w:rFonts w:ascii="Calibri" w:hAnsi="Calibri"/>
-          <w:color w:val="17201D"/>
-          <w:sz w:val="20"/>
-        </w:rPr>
-        <w:t>Interactive Follow-up Log: Sales users log chronological interactions and dynamically reschedule the next action date.</w:t>
-      </w:r>
-    </w:p>
-    <w:p>
-      <w:pPr>
-        <w:keepNext/>
-        <w:spacing w:before="200" w:after="80"/>
-      </w:pPr>
-      <w:r>
-        <w:rPr>
-          <w:rFonts w:ascii="Calibri" w:hAnsi="Calibri"/>
-          <w:b/>
-          <w:color w:val="196F50"/>
-          <w:sz w:val="26"/>
-        </w:rPr>
-        <w:t>Module 3: Products &amp; Inventory Management</w:t>
-      </w:r>
-    </w:p>
-    <w:p>
-      <w:pPr>
-        <w:pStyle w:val="ListBullet"/>
-        <w:spacing w:before="20" w:after="40" w:line="276" w:lineRule="auto"/>
-      </w:pPr>
-      <w:r>
-        <w:rPr>
-          <w:rFonts w:ascii="Calibri" w:hAnsi="Calibri"/>
-          <w:color w:val="17201D"/>
-          <w:sz w:val="20"/>
-        </w:rPr>
-        <w:t>Fields tracked: Product Name, SKU Code, Category, Unit Price (INR), Current On-Hand Stock, Minimum Stock Alert Threshold, and Warehouse Location.</w:t>
-      </w:r>
-    </w:p>
-    <w:p>
-      <w:pPr>
-        <w:pStyle w:val="ListBullet"/>
-        <w:spacing w:before="20" w:after="40" w:line="276" w:lineRule="auto"/>
-      </w:pPr>
-      <w:r>
-        <w:rPr>
-          <w:rFonts w:ascii="Calibri" w:hAnsi="Calibri"/>
-          <w:color w:val="17201D"/>
-          <w:sz w:val="20"/>
-        </w:rPr>
-        <w:t>Dynamic low-stock indicators displaying red warning tags when on-hand quantity &lt;= minimum threshold.</w:t>
-      </w:r>
-    </w:p>
-    <w:p>
-      <w:pPr>
-        <w:pStyle w:val="ListBullet"/>
-        <w:spacing w:before="20" w:after="40" w:line="276" w:lineRule="auto"/>
-      </w:pPr>
-      <w:r>
-        <w:rPr>
-          <w:rFonts w:ascii="Calibri" w:hAnsi="Calibri"/>
-          <w:color w:val="17201D"/>
-          <w:sz w:val="20"/>
-        </w:rPr>
-        <w:t>In-place modal editing allowing warehouse managers to update price, stock levels, and alert rules.</w:t>
-      </w:r>
-    </w:p>
-    <w:p>
-      <w:pPr>
-        <w:keepNext/>
-        <w:spacing w:before="200" w:after="80"/>
-      </w:pPr>
-      <w:r>
-        <w:rPr>
-          <w:rFonts w:ascii="Calibri" w:hAnsi="Calibri"/>
-          <w:b/>
-          <w:color w:val="196F50"/>
-          <w:sz w:val="26"/>
-        </w:rPr>
-        <w:t>Module 4: Stock Movement Audit Trail</w:t>
-      </w:r>
-    </w:p>
-    <w:p>
-      <w:pPr>
-        <w:pStyle w:val="ListBullet"/>
-        <w:spacing w:before="20" w:after="40" w:line="276" w:lineRule="auto"/>
-      </w:pPr>
-      <w:r>
-        <w:rPr>
-          <w:rFonts w:ascii="Calibri" w:hAnsi="Calibri"/>
-          <w:color w:val="17201D"/>
-          <w:sz w:val="20"/>
-        </w:rPr>
-        <w:t>Immutable record logging: Product, SKU, Movement Type (IN / OUT), Quantity Changed, Business Reason, Authorized User, and Timestamp.</w:t>
-      </w:r>
-    </w:p>
-    <w:p>
-      <w:pPr>
-        <w:pStyle w:val="ListBullet"/>
-        <w:spacing w:before="20" w:after="40" w:line="276" w:lineRule="auto"/>
-      </w:pPr>
-      <w:r>
-        <w:rPr>
-          <w:rFonts w:ascii="Calibri" w:hAnsi="Calibri"/>
-          <w:color w:val="17201D"/>
-          <w:sz w:val="20"/>
-        </w:rPr>
-        <w:t>Automatic background creation of 'OUT' movements upon challan confirmation, providing end-to-end trace integrity.</w:t>
-      </w:r>
-    </w:p>
-    <w:p>
-      <w:pPr>
-        <w:keepNext/>
-        <w:spacing w:before="200" w:after="80"/>
-      </w:pPr>
-      <w:r>
-        <w:rPr>
-          <w:rFonts w:ascii="Calibri" w:hAnsi="Calibri"/>
-          <w:b/>
-          <w:color w:val="196F50"/>
-          <w:sz w:val="26"/>
-        </w:rPr>
-        <w:t>Module 5: Sales Challan Flow &amp; Concurrency Safety</w:t>
-      </w:r>
-    </w:p>
-    <w:p>
-      <w:pPr>
-        <w:pStyle w:val="ListBullet"/>
-        <w:spacing w:before="20" w:after="40" w:line="276" w:lineRule="auto"/>
-      </w:pPr>
-      <w:r>
-        <w:rPr>
-          <w:rFonts w:ascii="Calibri" w:hAnsi="Calibri"/>
-          <w:color w:val="17201D"/>
-          <w:sz w:val="20"/>
-        </w:rPr>
-        <w:t>Multi-Product Line Items: Sales users can dynamically add multiple product items to a single challan with live subtotal and inventory checks.</w:t>
-      </w:r>
-    </w:p>
-    <w:p>
-      <w:pPr>
-        <w:pStyle w:val="ListBullet"/>
-        <w:spacing w:before="20" w:after="40" w:line="276" w:lineRule="auto"/>
-      </w:pPr>
-      <w:r>
-        <w:rPr>
-          <w:rFonts w:ascii="Calibri" w:hAnsi="Calibri"/>
-          <w:color w:val="17201D"/>
-          <w:sz w:val="20"/>
-        </w:rPr>
-        <w:t>Automatic Challan Number Generation in formatted sequence (e.g. CH-2026-XXXXXX).</w:t>
-      </w:r>
-    </w:p>
-    <w:p>
-      <w:pPr>
-        <w:pStyle w:val="ListBullet"/>
-        <w:spacing w:before="20" w:after="40" w:line="276" w:lineRule="auto"/>
-      </w:pPr>
-      <w:r>
-        <w:rPr>
-          <w:rFonts w:ascii="Calibri" w:hAnsi="Calibri"/>
-          <w:color w:val="17201D"/>
-          <w:sz w:val="20"/>
-        </w:rPr>
-        <w:t>Draft vs. Confirmed status: Drafts reserve no inventory; Confirmed status atomically decrements inventory.</w:t>
-      </w:r>
-    </w:p>
-    <w:p>
-      <w:pPr>
-        <w:pStyle w:val="ListBullet"/>
-        <w:spacing w:before="20" w:after="40" w:line="276" w:lineRule="auto"/>
-      </w:pPr>
-      <w:r>
-        <w:rPr>
-          <w:rFonts w:ascii="Calibri" w:hAnsi="Calibri"/>
-          <w:color w:val="17201D"/>
-          <w:sz w:val="20"/>
-        </w:rPr>
-        <w:t>Historical Pricing Snapshot: Challan line items preserve product name, SKU, and unit price in challan_items to guarantee invoice immutability.</w:t>
-      </w:r>
-    </w:p>
-    <w:p>
-      <w:pPr>
-        <w:pStyle w:val="ListBullet"/>
-        <w:spacing w:before="20" w:after="40" w:line="276" w:lineRule="auto"/>
-      </w:pPr>
-      <w:r>
-        <w:rPr>
-          <w:rFonts w:ascii="Calibri" w:hAnsi="Calibri"/>
-          <w:color w:val="17201D"/>
-          <w:sz w:val="20"/>
-        </w:rPr>
-        <w:t>Row-Level Locking (SELECT ... FOR UPDATE) prevents race conditions and overselling.</w:t>
-      </w:r>
-    </w:p>
-    <w:p>
-      <w:pPr>
-        <w:pStyle w:val="ListBullet"/>
-        <w:spacing w:before="20" w:after="40" w:line="276" w:lineRule="auto"/>
-      </w:pPr>
-      <w:r>
-        <w:rPr>
-          <w:rFonts w:ascii="Calibri" w:hAnsi="Calibri"/>
-          <w:color w:val="17201D"/>
-          <w:sz w:val="20"/>
-        </w:rPr>
-        <w:t>Zero Negative Stock Enforcement: If available inventory is insufficient, the transaction rolls back with HTTP 409 Conflict.</w:t>
-      </w:r>
-    </w:p>
-    <w:p>
-      <w:pPr>
-        <w:keepNext/>
-        <w:spacing w:before="280" w:after="120"/>
-      </w:pPr>
-      <w:r>
-        <w:rPr>
-          <w:rFonts w:ascii="Calibri" w:hAnsi="Calibri"/>
-          <w:b/>
-          <w:color w:val="102A22"/>
-          <w:sz w:val="32"/>
-        </w:rPr>
-        <w:t>5. Bonus Points Implementation</w:t>
+        <w:t>Key engineering achievements in this submission include:</w:t>
       </w:r>
     </w:p>
     <w:p>
@@ -1191,17 +307,17 @@
           <w:rFonts w:ascii="Calibri" w:hAnsi="Calibri"/>
           <w:b/>
           <w:color w:val="17201D"/>
-          <w:sz w:val="20"/>
+          <w:sz w:val="19"/>
         </w:rPr>
-        <w:t xml:space="preserve">1. Containerization: </w:t>
+        <w:t xml:space="preserve">• Role-Driven Architecture: </w:t>
       </w:r>
       <w:r>
         <w:rPr>
           <w:rFonts w:ascii="Calibri" w:hAnsi="Calibri"/>
           <w:color w:val="17201D"/>
-          <w:sz w:val="20"/>
+          <w:sz w:val="19"/>
         </w:rPr>
-        <w:t>Docker Setup: Complete docker-compose.yml orchestrating PostgreSQL, multi-stage Node backend, and Nginx frontend.</w:t>
+        <w:t>Distinct, decoupled workspaces and login experiences for Executive Administrators versus Staff members (Sales, Warehouse, Accounts).</w:t>
       </w:r>
     </w:p>
     <w:p>
@@ -1214,17 +330,17 @@
           <w:rFonts w:ascii="Calibri" w:hAnsi="Calibri"/>
           <w:b/>
           <w:color w:val="17201D"/>
-          <w:sz w:val="20"/>
+          <w:sz w:val="19"/>
         </w:rPr>
-        <w:t xml:space="preserve">2. Automated CI/CD: </w:t>
+        <w:t xml:space="preserve">• Concurrency Safety: </w:t>
       </w:r>
       <w:r>
         <w:rPr>
           <w:rFonts w:ascii="Calibri" w:hAnsi="Calibri"/>
           <w:color w:val="17201D"/>
-          <w:sz w:val="20"/>
+          <w:sz w:val="19"/>
         </w:rPr>
-        <w:t>GitHub Actions CI: Fully automated .github/workflows/ci.yml pipeline for continuous integration and typechecking.</w:t>
+        <w:t>Atomic stock deduction with PostgreSQL row-level locks (SELECT ... FOR UPDATE), guaranteeing zero negative inventory and no race conditions.</w:t>
       </w:r>
     </w:p>
     <w:p>
@@ -1237,135 +353,17 @@
           <w:rFonts w:ascii="Calibri" w:hAnsi="Calibri"/>
           <w:b/>
           <w:color w:val="17201D"/>
-          <w:sz w:val="20"/>
+          <w:sz w:val="19"/>
         </w:rPr>
-        <w:t xml:space="preserve">3. PDF Export: </w:t>
+        <w:t xml:space="preserve">• Historical Snapshot Integrity: </w:t>
       </w:r>
       <w:r>
         <w:rPr>
           <w:rFonts w:ascii="Calibri" w:hAnsi="Calibri"/>
           <w:color w:val="17201D"/>
-          <w:sz w:val="20"/>
+          <w:sz w:val="19"/>
         </w:rPr>
-        <w:t>Invoice &amp; Delivery Challan PDF Export: One-click print/PDF layout with company headers, customer GST, itemized totals, and signatures.</w:t>
-      </w:r>
-    </w:p>
-    <w:p>
-      <w:pPr>
-        <w:keepNext/>
-        <w:spacing w:before="280" w:after="120"/>
-      </w:pPr>
-      <w:r>
-        <w:rPr>
-          <w:rFonts w:ascii="Calibri" w:hAnsi="Calibri"/>
-          <w:b/>
-          <w:color w:val="102A22"/>
-          <w:sz w:val="32"/>
-        </w:rPr>
-        <w:t>6. Step-by-Step Local Execution Guide</w:t>
-      </w:r>
-    </w:p>
-    <w:p>
-      <w:pPr>
-        <w:spacing w:before="40" w:after="80" w:line="276" w:lineRule="auto"/>
-      </w:pPr>
-      <w:r>
-        <w:rPr>
-          <w:rFonts w:ascii="Calibri" w:hAnsi="Calibri"/>
-          <w:color w:val="17201D"/>
-          <w:sz w:val="21"/>
-        </w:rPr>
-        <w:t>The project is 100% verified and operational on the development workstation.</w:t>
-      </w:r>
-    </w:p>
-    <w:p>
-      <w:pPr>
-        <w:spacing w:before="40" w:after="80" w:line="276" w:lineRule="auto"/>
-      </w:pPr>
-      <w:r>
-        <w:rPr>
-          <w:rFonts w:ascii="Calibri" w:hAnsi="Calibri"/>
-          <w:color w:val="17201D"/>
-          <w:sz w:val="21"/>
-        </w:rPr>
-        <w:t>Step 1: Open VS Code terminal in the project directory (fundsroom project).</w:t>
-      </w:r>
-    </w:p>
-    <w:p>
-      <w:pPr>
-        <w:spacing w:before="40" w:after="80" w:line="276" w:lineRule="auto"/>
-      </w:pPr>
-      <w:r>
-        <w:rPr>
-          <w:rFonts w:ascii="Calibri" w:hAnsi="Calibri"/>
-          <w:color w:val="17201D"/>
-          <w:sz w:val="21"/>
-        </w:rPr>
-        <w:t>Step 2: Start both client and server concurrently by executing:</w:t>
-      </w:r>
-    </w:p>
-    <w:p>
-      <w:r>
-        <w:rPr>
-          <w:rFonts w:ascii="Consolas" w:hAnsi="Consolas"/>
-          <w:b/>
-          <w:color w:val="196F50"/>
-        </w:rPr>
-        <w:t>pnpm dev   (or npm run dev)</w:t>
-      </w:r>
-    </w:p>
-    <w:p>
-      <w:pPr>
-        <w:spacing w:before="40" w:after="80" w:line="276" w:lineRule="auto"/>
-      </w:pPr>
-      <w:r>
-        <w:rPr>
-          <w:rFonts w:ascii="Calibri" w:hAnsi="Calibri"/>
-          <w:color w:val="17201D"/>
-          <w:sz w:val="21"/>
-        </w:rPr>
-        <w:t>Step 3: Open your browser and navigate to: http://localhost:5173</w:t>
-      </w:r>
-    </w:p>
-    <w:p>
-      <w:pPr>
-        <w:spacing w:before="40" w:after="80" w:line="276" w:lineRule="auto"/>
-      </w:pPr>
-      <w:r>
-        <w:rPr>
-          <w:rFonts w:ascii="Calibri" w:hAnsi="Calibri"/>
-          <w:color w:val="17201D"/>
-          <w:sz w:val="21"/>
-        </w:rPr>
-        <w:t>Step 4: Log in using any of the 4 test accounts listed in Section 3.</w:t>
-      </w:r>
-    </w:p>
-    <w:p>
-      <w:pPr>
-        <w:keepNext/>
-        <w:spacing w:before="280" w:after="120"/>
-      </w:pPr>
-      <w:r>
-        <w:rPr>
-          <w:rFonts w:ascii="Calibri" w:hAnsi="Calibri"/>
-          <w:b/>
-          <w:color w:val="102A22"/>
-          <w:sz w:val="32"/>
-        </w:rPr>
-        <w:t>7. Screen Recording &amp; Submission Checklist</w:t>
-      </w:r>
-    </w:p>
-    <w:p>
-      <w:pPr>
-        <w:spacing w:before="40" w:after="80" w:line="276" w:lineRule="auto"/>
-      </w:pPr>
-      <w:r>
-        <w:rPr>
-          <w:rFonts w:ascii="Calibri" w:hAnsi="Calibri"/>
-          <w:color w:val="17201D"/>
-          <w:sz w:val="21"/>
-        </w:rPr>
-        <w:t>As mandated in the assessment instructions, ensure the following steps are performed:</w:t>
+        <w:t>Preserving product name, SKU, and unit price in challan_items to maintain historical accuracy regardless of future catalog changes.</w:t>
       </w:r>
     </w:p>
     <w:p>
@@ -1378,17 +376,17 @@
           <w:rFonts w:ascii="Calibri" w:hAnsi="Calibri"/>
           <w:b/>
           <w:color w:val="17201D"/>
-          <w:sz w:val="20"/>
+          <w:sz w:val="19"/>
         </w:rPr>
-        <w:t xml:space="preserve">1. Screen Recording: </w:t>
+        <w:t xml:space="preserve">• Bonus Implementations: </w:t>
       </w:r>
       <w:r>
         <w:rPr>
           <w:rFonts w:ascii="Calibri" w:hAnsi="Calibri"/>
           <w:color w:val="17201D"/>
-          <w:sz w:val="20"/>
+          <w:sz w:val="19"/>
         </w:rPr>
-        <w:t>Start your screen recorder (OBS Studio, Windows Game Bar [Win + G], or Loom).</w:t>
+        <w:t>Full containerization via Docker Compose, automated CI/CD via GitHub Actions, and browser-native PDF delivery note export.</w:t>
       </w:r>
     </w:p>
     <w:p>
@@ -1401,17 +399,1611 @@
           <w:rFonts w:ascii="Calibri" w:hAnsi="Calibri"/>
           <w:b/>
           <w:color w:val="17201D"/>
-          <w:sz w:val="20"/>
+          <w:sz w:val="19"/>
         </w:rPr>
-        <w:t xml:space="preserve">2. CRM Flow: </w:t>
+        <w:t xml:space="preserve">• Immediate Joining Commitment: </w:t>
       </w:r>
+      <w:r>
+        <w:rPr>
+          <w:rFonts w:ascii="Calibri" w:hAnsi="Calibri"/>
+          <w:color w:val="17201D"/>
+          <w:sz w:val="19"/>
+        </w:rPr>
+        <w:t>I confirm my 100% availability for immediate joining in Pune, Maharashtra upon selection.</w:t>
+      </w:r>
+    </w:p>
+    <w:p>
+      <w:pPr>
+        <w:keepNext/>
+        <w:spacing w:before="280" w:after="100"/>
+      </w:pPr>
+      <w:r>
+        <w:rPr>
+          <w:rFonts w:ascii="Calibri" w:hAnsi="Calibri"/>
+          <w:b/>
+          <w:color w:val="102A22"/>
+          <w:sz w:val="30"/>
+        </w:rPr>
+        <w:t>2. Tools &amp; Technologies Used &amp; How They Work</w:t>
+      </w:r>
+    </w:p>
+    <w:p>
+      <w:pPr>
+        <w:spacing w:before="40" w:after="80" w:line="276" w:lineRule="auto"/>
+      </w:pPr>
       <w:r>
         <w:rPr>
           <w:rFonts w:ascii="Calibri" w:hAnsi="Calibri"/>
           <w:color w:val="17201D"/>
           <w:sz w:val="20"/>
         </w:rPr>
-        <w:t>Demonstrate Admin login, overview metrics, and customer creation with GST number.</w:t>
+        <w:t>The project leverages modern industry tools chosen specifically for speed, reliability, type safety, and scalability:</w:t>
+      </w:r>
+    </w:p>
+    <w:tbl>
+      <w:tblPr>
+        <w:tblW w:type="auto" w:w="0"/>
+        <w:jc w:val="center"/>
+        <w:tblLook w:firstColumn="1" w:firstRow="1" w:lastColumn="0" w:lastRow="0" w:noHBand="0" w:noVBand="1" w:val="04A0"/>
+      </w:tblPr>
+      <w:tblGrid>
+        <w:gridCol w:w="3360"/>
+        <w:gridCol w:w="3360"/>
+        <w:gridCol w:w="3360"/>
+      </w:tblGrid>
+      <w:tr>
+        <w:tc>
+          <w:tcPr>
+            <w:tcW w:type="dxa" w:w="3360"/>
+            <w:shd w:fill="102A22"/>
+          </w:tcPr>
+          <w:p>
+            <w:r>
+              <w:t>Tool / Technology</w:t>
+            </w:r>
+          </w:p>
+        </w:tc>
+        <w:tc>
+          <w:tcPr>
+            <w:tcW w:type="dxa" w:w="3360"/>
+            <w:shd w:fill="102A22"/>
+          </w:tcPr>
+          <w:p>
+            <w:r>
+              <w:t>Layer</w:t>
+            </w:r>
+          </w:p>
+        </w:tc>
+        <w:tc>
+          <w:tcPr>
+            <w:tcW w:type="dxa" w:w="3360"/>
+            <w:shd w:fill="102A22"/>
+          </w:tcPr>
+          <w:p>
+            <w:r>
+              <w:t>How It Works &amp; Business Value</w:t>
+            </w:r>
+          </w:p>
+        </w:tc>
+      </w:tr>
+      <w:tr>
+        <w:tc>
+          <w:tcPr>
+            <w:tcW w:type="dxa" w:w="3360"/>
+          </w:tcPr>
+          <w:p>
+            <w:r>
+              <w:rPr>
+                <w:b/>
+                <w:color w:val="17201D"/>
+                <w:sz w:val="17"/>
+              </w:rPr>
+              <w:t>React 18 &amp; TypeScript</w:t>
+            </w:r>
+          </w:p>
+        </w:tc>
+        <w:tc>
+          <w:tcPr>
+            <w:tcW w:type="dxa" w:w="3360"/>
+          </w:tcPr>
+          <w:p>
+            <w:r>
+              <w:rPr>
+                <w:color w:val="17201D"/>
+                <w:sz w:val="17"/>
+              </w:rPr>
+              <w:t>Frontend Tier</w:t>
+            </w:r>
+          </w:p>
+        </w:tc>
+        <w:tc>
+          <w:tcPr>
+            <w:tcW w:type="dxa" w:w="3360"/>
+          </w:tcPr>
+          <w:p>
+            <w:r>
+              <w:rPr>
+                <w:color w:val="17201D"/>
+                <w:sz w:val="17"/>
+              </w:rPr>
+              <w:t>Provides a robust Single Page Application (SPA) architecture with strict type safety, modular component lifecycle management, and instant sub-second bundling with Vite.</w:t>
+            </w:r>
+          </w:p>
+        </w:tc>
+      </w:tr>
+      <w:tr>
+        <w:tc>
+          <w:tcPr>
+            <w:tcW w:type="dxa" w:w="3360"/>
+          </w:tcPr>
+          <w:p>
+            <w:r>
+              <w:rPr>
+                <w:b/>
+                <w:color w:val="17201D"/>
+                <w:sz w:val="17"/>
+              </w:rPr>
+              <w:t>Node.js 24 &amp; Express.js</w:t>
+            </w:r>
+          </w:p>
+        </w:tc>
+        <w:tc>
+          <w:tcPr>
+            <w:tcW w:type="dxa" w:w="3360"/>
+          </w:tcPr>
+          <w:p>
+            <w:r>
+              <w:rPr>
+                <w:color w:val="17201D"/>
+                <w:sz w:val="17"/>
+              </w:rPr>
+              <w:t>Backend REST API</w:t>
+            </w:r>
+          </w:p>
+        </w:tc>
+        <w:tc>
+          <w:tcPr>
+            <w:tcW w:type="dxa" w:w="3360"/>
+          </w:tcPr>
+          <w:p>
+            <w:r>
+              <w:rPr>
+                <w:color w:val="17201D"/>
+                <w:sz w:val="17"/>
+              </w:rPr>
+              <w:t>Asynchronous, event-driven RESTful micro-service with express-validator validation pipelines, role authorization middleware, and centralized error handling.</w:t>
+            </w:r>
+          </w:p>
+        </w:tc>
+      </w:tr>
+      <w:tr>
+        <w:tc>
+          <w:tcPr>
+            <w:tcW w:type="dxa" w:w="3360"/>
+          </w:tcPr>
+          <w:p>
+            <w:r>
+              <w:rPr>
+                <w:b/>
+                <w:color w:val="17201D"/>
+                <w:sz w:val="17"/>
+              </w:rPr>
+              <w:t>PostgreSQL (Neon Cloud AWS)</w:t>
+            </w:r>
+          </w:p>
+        </w:tc>
+        <w:tc>
+          <w:tcPr>
+            <w:tcW w:type="dxa" w:w="3360"/>
+          </w:tcPr>
+          <w:p>
+            <w:r>
+              <w:rPr>
+                <w:color w:val="17201D"/>
+                <w:sz w:val="17"/>
+              </w:rPr>
+              <w:t>Database Tier</w:t>
+            </w:r>
+          </w:p>
+        </w:tc>
+        <w:tc>
+          <w:tcPr>
+            <w:tcW w:type="dxa" w:w="3360"/>
+          </w:tcPr>
+          <w:p>
+            <w:r>
+              <w:rPr>
+                <w:color w:val="17201D"/>
+                <w:sz w:val="17"/>
+              </w:rPr>
+              <w:t>Serverless PostgreSQL engine providing ACID transactional integrity, multi-client connection pooling, and row-level locking primitives.</w:t>
+            </w:r>
+          </w:p>
+        </w:tc>
+      </w:tr>
+      <w:tr>
+        <w:tc>
+          <w:tcPr>
+            <w:tcW w:type="dxa" w:w="3360"/>
+          </w:tcPr>
+          <w:p>
+            <w:r>
+              <w:rPr>
+                <w:b/>
+                <w:color w:val="17201D"/>
+                <w:sz w:val="17"/>
+              </w:rPr>
+              <w:t>JSON Web Tokens (JWT) &amp; Bcrypt</w:t>
+            </w:r>
+          </w:p>
+        </w:tc>
+        <w:tc>
+          <w:tcPr>
+            <w:tcW w:type="dxa" w:w="3360"/>
+          </w:tcPr>
+          <w:p>
+            <w:r>
+              <w:rPr>
+                <w:color w:val="17201D"/>
+                <w:sz w:val="17"/>
+              </w:rPr>
+              <w:t>Security &amp; Auth</w:t>
+            </w:r>
+          </w:p>
+        </w:tc>
+        <w:tc>
+          <w:tcPr>
+            <w:tcW w:type="dxa" w:w="3360"/>
+          </w:tcPr>
+          <w:p>
+            <w:r>
+              <w:rPr>
+                <w:color w:val="17201D"/>
+                <w:sz w:val="17"/>
+              </w:rPr>
+              <w:t>Stateless authentication using cryptographically signed JWT tokens with 24-hour expiration, paired with salted bcrypt hashing (10–12 salt rounds) for password storage.</w:t>
+            </w:r>
+          </w:p>
+        </w:tc>
+      </w:tr>
+      <w:tr>
+        <w:tc>
+          <w:tcPr>
+            <w:tcW w:type="dxa" w:w="3360"/>
+          </w:tcPr>
+          <w:p>
+            <w:r>
+              <w:rPr>
+                <w:b/>
+                <w:color w:val="17201D"/>
+                <w:sz w:val="17"/>
+              </w:rPr>
+              <w:t>Docker &amp; Docker Compose</w:t>
+            </w:r>
+          </w:p>
+        </w:tc>
+        <w:tc>
+          <w:tcPr>
+            <w:tcW w:type="dxa" w:w="3360"/>
+          </w:tcPr>
+          <w:p>
+            <w:r>
+              <w:rPr>
+                <w:color w:val="17201D"/>
+                <w:sz w:val="17"/>
+              </w:rPr>
+              <w:t>Containerization (Bonus)</w:t>
+            </w:r>
+          </w:p>
+        </w:tc>
+        <w:tc>
+          <w:tcPr>
+            <w:tcW w:type="dxa" w:w="3360"/>
+          </w:tcPr>
+          <w:p>
+            <w:r>
+              <w:rPr>
+                <w:color w:val="17201D"/>
+                <w:sz w:val="17"/>
+              </w:rPr>
+              <w:t>Multi-stage Dockerfiles for backend (Node 22-alpine) and frontend (Nginx alpine) orchestrated via docker-compose.yml with local PostgreSQL networking.</w:t>
+            </w:r>
+          </w:p>
+        </w:tc>
+      </w:tr>
+      <w:tr>
+        <w:tc>
+          <w:tcPr>
+            <w:tcW w:type="dxa" w:w="3360"/>
+          </w:tcPr>
+          <w:p>
+            <w:r>
+              <w:rPr>
+                <w:b/>
+                <w:color w:val="17201D"/>
+                <w:sz w:val="17"/>
+              </w:rPr>
+              <w:t>GitHub Actions</w:t>
+            </w:r>
+          </w:p>
+        </w:tc>
+        <w:tc>
+          <w:tcPr>
+            <w:tcW w:type="dxa" w:w="3360"/>
+          </w:tcPr>
+          <w:p>
+            <w:r>
+              <w:rPr>
+                <w:color w:val="17201D"/>
+                <w:sz w:val="17"/>
+              </w:rPr>
+              <w:t>CI / CD Pipeline (Bonus)</w:t>
+            </w:r>
+          </w:p>
+        </w:tc>
+        <w:tc>
+          <w:tcPr>
+            <w:tcW w:type="dxa" w:w="3360"/>
+          </w:tcPr>
+          <w:p>
+            <w:r>
+              <w:rPr>
+                <w:color w:val="17201D"/>
+                <w:sz w:val="17"/>
+              </w:rPr>
+              <w:t>Automated continuous integration pipeline (.github/workflows/ci.yml) validating TypeScript compilation, linting, and production builds on push/PR.</w:t>
+            </w:r>
+          </w:p>
+        </w:tc>
+      </w:tr>
+      <w:tr>
+        <w:tc>
+          <w:tcPr>
+            <w:tcW w:type="dxa" w:w="3360"/>
+          </w:tcPr>
+          <w:p>
+            <w:r>
+              <w:rPr>
+                <w:b/>
+                <w:color w:val="17201D"/>
+                <w:sz w:val="17"/>
+              </w:rPr>
+              <w:t>Postman Collection</w:t>
+            </w:r>
+          </w:p>
+        </w:tc>
+        <w:tc>
+          <w:tcPr>
+            <w:tcW w:type="dxa" w:w="3360"/>
+          </w:tcPr>
+          <w:p>
+            <w:r>
+              <w:rPr>
+                <w:color w:val="17201D"/>
+                <w:sz w:val="17"/>
+              </w:rPr>
+              <w:t>API Testing (Bonus)</w:t>
+            </w:r>
+          </w:p>
+        </w:tc>
+        <w:tc>
+          <w:tcPr>
+            <w:tcW w:type="dxa" w:w="3360"/>
+          </w:tcPr>
+          <w:p>
+            <w:r>
+              <w:rPr>
+                <w:color w:val="17201D"/>
+                <w:sz w:val="17"/>
+              </w:rPr>
+              <w:t>Structured collection (postman/Fundsroom-ERP.postman_collection.json) covering 100% of REST endpoints across auth, CRM, products, and challans.</w:t>
+            </w:r>
+          </w:p>
+        </w:tc>
+      </w:tr>
+      <w:tr>
+        <w:tc>
+          <w:tcPr>
+            <w:tcW w:type="dxa" w:w="3360"/>
+          </w:tcPr>
+          <w:p>
+            <w:r>
+              <w:rPr>
+                <w:b/>
+                <w:color w:val="17201D"/>
+                <w:sz w:val="17"/>
+              </w:rPr>
+              <w:t>Render Cloud Hosting</w:t>
+            </w:r>
+          </w:p>
+        </w:tc>
+        <w:tc>
+          <w:tcPr>
+            <w:tcW w:type="dxa" w:w="3360"/>
+          </w:tcPr>
+          <w:p>
+            <w:r>
+              <w:rPr>
+                <w:color w:val="17201D"/>
+                <w:sz w:val="17"/>
+              </w:rPr>
+              <w:t>Cloud Deployment</w:t>
+            </w:r>
+          </w:p>
+        </w:tc>
+        <w:tc>
+          <w:tcPr>
+            <w:tcW w:type="dxa" w:w="3360"/>
+          </w:tcPr>
+          <w:p>
+            <w:r>
+              <w:rPr>
+                <w:color w:val="17201D"/>
+                <w:sz w:val="17"/>
+              </w:rPr>
+              <w:t>Configured for zero-downtime deployment on Render.com with single-service production serving (Express serving client/dist static build).</w:t>
+            </w:r>
+          </w:p>
+        </w:tc>
+      </w:tr>
+    </w:tbl>
+    <w:p>
+      <w:pPr>
+        <w:spacing w:before="160" w:after="60"/>
+        <w:jc w:val="center"/>
+      </w:pPr>
+      <w:r>
+        <w:drawing>
+          <wp:inline xmlns:a="http://schemas.openxmlformats.org/drawingml/2006/main" xmlns:pic="http://schemas.openxmlformats.org/drawingml/2006/picture">
+            <wp:extent cx="5669280" cy="3068693"/>
+            <wp:docPr id="1" name="Picture 1"/>
+            <wp:cNvGraphicFramePr>
+              <a:graphicFrameLocks noChangeAspect="1"/>
+            </wp:cNvGraphicFramePr>
+            <a:graphic>
+              <a:graphicData uri="http://schemas.openxmlformats.org/drawingml/2006/picture">
+                <pic:pic>
+                  <pic:nvPicPr>
+                    <pic:cNvPr id="0" name="architecture_diagram.png"/>
+                    <pic:cNvPicPr/>
+                  </pic:nvPicPr>
+                  <pic:blipFill>
+                    <a:blip r:embed="rId9"/>
+                    <a:stretch>
+                      <a:fillRect/>
+                    </a:stretch>
+                  </pic:blipFill>
+                  <pic:spPr>
+                    <a:xfrm>
+                      <a:off x="0" y="0"/>
+                      <a:ext cx="5669280" cy="3068693"/>
+                    </a:xfrm>
+                    <a:prstGeom prst="rect"/>
+                  </pic:spPr>
+                </pic:pic>
+              </a:graphicData>
+            </a:graphic>
+          </wp:inline>
+        </w:drawing>
+      </w:r>
+    </w:p>
+    <w:p>
+      <w:pPr>
+        <w:spacing w:before="0" w:after="200"/>
+        <w:jc w:val="center"/>
+      </w:pPr>
+      <w:r>
+        <w:rPr>
+          <w:rFonts w:ascii="Calibri" w:hAnsi="Calibri"/>
+          <w:b/>
+          <w:i/>
+          <w:color w:val="64746D"/>
+          <w:sz w:val="18"/>
+        </w:rPr>
+        <w:t>Figure 1: Full-Stack System Architecture (React Frontend, Express API, Neon PostgreSQL DB, and Docker/CI Infrastructure)</w:t>
+      </w:r>
+    </w:p>
+    <w:p>
+      <w:pPr>
+        <w:keepNext/>
+        <w:spacing w:before="280" w:after="100"/>
+      </w:pPr>
+      <w:r>
+        <w:rPr>
+          <w:rFonts w:ascii="Calibri" w:hAnsi="Calibri"/>
+          <w:b/>
+          <w:color w:val="102A22"/>
+          <w:sz w:val="30"/>
+        </w:rPr>
+        <w:t>3. Database Schema &amp; Data Integrity Design</w:t>
+      </w:r>
+    </w:p>
+    <w:p>
+      <w:pPr>
+        <w:spacing w:before="40" w:after="80" w:line="276" w:lineRule="auto"/>
+      </w:pPr>
+      <w:r>
+        <w:rPr>
+          <w:rFonts w:ascii="Calibri" w:hAnsi="Calibri"/>
+          <w:color w:val="17201D"/>
+          <w:sz w:val="20"/>
+        </w:rPr>
+        <w:t>The database architecture is designed with 7 normalized tables, enforcing relational foreign key constraints, automatic timestamps, and check constraints to prevent invalid operational states:</w:t>
+      </w:r>
+    </w:p>
+    <w:p>
+      <w:pPr>
+        <w:pStyle w:val="ListBullet"/>
+        <w:spacing w:before="20" w:after="40" w:line="276" w:lineRule="auto"/>
+      </w:pPr>
+      <w:r>
+        <w:rPr>
+          <w:rFonts w:ascii="Calibri" w:hAnsi="Calibri"/>
+          <w:color w:val="17201D"/>
+          <w:sz w:val="19"/>
+        </w:rPr>
+        <w:t>users: Stores employee credentials, salted password hashes, and strictly enumerated roles (Admin, Sales, Warehouse, Accounts).</w:t>
+      </w:r>
+    </w:p>
+    <w:p>
+      <w:pPr>
+        <w:pStyle w:val="ListBullet"/>
+        <w:spacing w:before="20" w:after="40" w:line="276" w:lineRule="auto"/>
+      </w:pPr>
+      <w:r>
+        <w:rPr>
+          <w:rFonts w:ascii="Calibri" w:hAnsi="Calibri"/>
+          <w:color w:val="17201D"/>
+          <w:sz w:val="19"/>
+        </w:rPr>
+        <w:t>customers: Complete CRM records including business name, mobile, email, customer type (Retail/Wholesale/Distributor), status (Lead/Active/Inactive), follow-up date, and optional GSTIN.</w:t>
+      </w:r>
+    </w:p>
+    <w:p>
+      <w:pPr>
+        <w:pStyle w:val="ListBullet"/>
+        <w:spacing w:before="20" w:after="40" w:line="276" w:lineRule="auto"/>
+      </w:pPr>
+      <w:r>
+        <w:rPr>
+          <w:rFonts w:ascii="Calibri" w:hAnsi="Calibri"/>
+          <w:color w:val="17201D"/>
+          <w:sz w:val="19"/>
+        </w:rPr>
+        <w:t>customer_followups: Chronological interaction history linked to customers with created_by employee foreign key.</w:t>
+      </w:r>
+    </w:p>
+    <w:p>
+      <w:pPr>
+        <w:pStyle w:val="ListBullet"/>
+        <w:spacing w:before="20" w:after="40" w:line="276" w:lineRule="auto"/>
+      </w:pPr>
+      <w:r>
+        <w:rPr>
+          <w:rFonts w:ascii="Calibri" w:hAnsi="Calibri"/>
+          <w:color w:val="17201D"/>
+          <w:sz w:val="19"/>
+        </w:rPr>
+        <w:t>products: Catalog SKUs, categories, unit prices (NUMERIC 12,2), on-hand stock (CHECK &gt;= 0), minimum alert thresholds, and warehouse location.</w:t>
+      </w:r>
+    </w:p>
+    <w:p>
+      <w:pPr>
+        <w:pStyle w:val="ListBullet"/>
+        <w:spacing w:before="20" w:after="40" w:line="276" w:lineRule="auto"/>
+      </w:pPr>
+      <w:r>
+        <w:rPr>
+          <w:rFonts w:ascii="Calibri" w:hAnsi="Calibri"/>
+          <w:color w:val="17201D"/>
+          <w:sz w:val="19"/>
+        </w:rPr>
+        <w:t>stock_movements: Immutable audit trail tracking product, movement direction (IN/OUT), quantity changed (&gt; 0), reason reference, and authorized employee.</w:t>
+      </w:r>
+    </w:p>
+    <w:p>
+      <w:pPr>
+        <w:pStyle w:val="ListBullet"/>
+        <w:spacing w:before="20" w:after="40" w:line="276" w:lineRule="auto"/>
+      </w:pPr>
+      <w:r>
+        <w:rPr>
+          <w:rFonts w:ascii="Calibri" w:hAnsi="Calibri"/>
+          <w:color w:val="17201D"/>
+          <w:sz w:val="19"/>
+        </w:rPr>
+        <w:t>challans: Outbound delivery orders with unique formatted challan numbers (CH-YYYY-XXXXXX), customer relation, total items, and status (Draft/Confirmed/Cancelled).</w:t>
+      </w:r>
+    </w:p>
+    <w:p>
+      <w:pPr>
+        <w:pStyle w:val="ListBullet"/>
+        <w:spacing w:before="20" w:after="40" w:line="276" w:lineRule="auto"/>
+      </w:pPr>
+      <w:r>
+        <w:rPr>
+          <w:rFonts w:ascii="Calibri" w:hAnsi="Calibri"/>
+          <w:color w:val="17201D"/>
+          <w:sz w:val="19"/>
+        </w:rPr>
+        <w:t>challan_items: Historical product snapshot preserving product name, SKU, and unit price at moment of sale.</w:t>
+      </w:r>
+    </w:p>
+    <w:p>
+      <w:pPr>
+        <w:spacing w:before="160" w:after="60"/>
+        <w:jc w:val="center"/>
+      </w:pPr>
+      <w:r>
+        <w:drawing>
+          <wp:inline xmlns:a="http://schemas.openxmlformats.org/drawingml/2006/main" xmlns:pic="http://schemas.openxmlformats.org/drawingml/2006/picture">
+            <wp:extent cx="5669280" cy="3588810"/>
+            <wp:docPr id="2" name="Picture 2"/>
+            <wp:cNvGraphicFramePr>
+              <a:graphicFrameLocks noChangeAspect="1"/>
+            </wp:cNvGraphicFramePr>
+            <a:graphic>
+              <a:graphicData uri="http://schemas.openxmlformats.org/drawingml/2006/picture">
+                <pic:pic>
+                  <pic:nvPicPr>
+                    <pic:cNvPr id="0" name="database_erd.png"/>
+                    <pic:cNvPicPr/>
+                  </pic:nvPicPr>
+                  <pic:blipFill>
+                    <a:blip r:embed="rId10"/>
+                    <a:stretch>
+                      <a:fillRect/>
+                    </a:stretch>
+                  </pic:blipFill>
+                  <pic:spPr>
+                    <a:xfrm>
+                      <a:off x="0" y="0"/>
+                      <a:ext cx="5669280" cy="3588810"/>
+                    </a:xfrm>
+                    <a:prstGeom prst="rect"/>
+                  </pic:spPr>
+                </pic:pic>
+              </a:graphicData>
+            </a:graphic>
+          </wp:inline>
+        </w:drawing>
+      </w:r>
+    </w:p>
+    <w:p>
+      <w:pPr>
+        <w:spacing w:before="0" w:after="200"/>
+        <w:jc w:val="center"/>
+      </w:pPr>
+      <w:r>
+        <w:rPr>
+          <w:rFonts w:ascii="Calibri" w:hAnsi="Calibri"/>
+          <w:b/>
+          <w:i/>
+          <w:color w:val="64746D"/>
+          <w:sz w:val="18"/>
+        </w:rPr>
+        <w:t>Figure 2: Relational Database Entity Relationship Diagram (ERD) with Constraints &amp; Snapshots</w:t>
+      </w:r>
+    </w:p>
+    <w:p>
+      <w:pPr>
+        <w:keepNext/>
+        <w:spacing w:before="280" w:after="100"/>
+      </w:pPr>
+      <w:r>
+        <w:rPr>
+          <w:rFonts w:ascii="Calibri" w:hAnsi="Calibri"/>
+          <w:b/>
+          <w:color w:val="102A22"/>
+          <w:sz w:val="30"/>
+        </w:rPr>
+        <w:t>4. Transaction Safety &amp; Concurrency Control (Stock Safety)</w:t>
+      </w:r>
+    </w:p>
+    <w:p>
+      <w:pPr>
+        <w:spacing w:before="40" w:after="80" w:line="276" w:lineRule="auto"/>
+      </w:pPr>
+      <w:r>
+        <w:rPr>
+          <w:rFonts w:ascii="Calibri" w:hAnsi="Calibri"/>
+          <w:color w:val="17201D"/>
+          <w:sz w:val="20"/>
+        </w:rPr>
+        <w:t>In high-volume wholesale distribution, race conditions during order placement can lead to inventory overselling or negative stock balances. OrbitOps solves this at the database engine level:</w:t>
+      </w:r>
+    </w:p>
+    <w:p>
+      <w:pPr>
+        <w:pStyle w:val="ListBullet"/>
+        <w:spacing w:before="20" w:after="40" w:line="276" w:lineRule="auto"/>
+      </w:pPr>
+      <w:r>
+        <w:rPr>
+          <w:rFonts w:ascii="Calibri" w:hAnsi="Calibri"/>
+          <w:color w:val="17201D"/>
+          <w:sz w:val="19"/>
+        </w:rPr>
+        <w:t>When a sales challan is confirmed, Express initiates an atomic transaction using BEGIN.</w:t>
+      </w:r>
+    </w:p>
+    <w:p>
+      <w:pPr>
+        <w:pStyle w:val="ListBullet"/>
+        <w:spacing w:before="20" w:after="40" w:line="276" w:lineRule="auto"/>
+      </w:pPr>
+      <w:r>
+        <w:rPr>
+          <w:rFonts w:ascii="Calibri" w:hAnsi="Calibri"/>
+          <w:color w:val="17201D"/>
+          <w:sz w:val="19"/>
+        </w:rPr>
+        <w:t>PostgreSQL Row-Level Locking: Executes SELECT current_stock FROM products WHERE id = $1 FOR UPDATE. This locks the specific product rows against concurrent modifications.</w:t>
+      </w:r>
+    </w:p>
+    <w:p>
+      <w:pPr>
+        <w:pStyle w:val="ListBullet"/>
+        <w:spacing w:before="20" w:after="40" w:line="276" w:lineRule="auto"/>
+      </w:pPr>
+      <w:r>
+        <w:rPr>
+          <w:rFonts w:ascii="Calibri" w:hAnsi="Calibri"/>
+          <w:color w:val="17201D"/>
+          <w:sz w:val="19"/>
+        </w:rPr>
+        <w:t>Zero Negative Stock Check: If current_stock &lt; requested_quantity, the transaction immediately executes ROLLBACK and returns HTTP 409 Conflict with an error message.</w:t>
+      </w:r>
+    </w:p>
+    <w:p>
+      <w:pPr>
+        <w:pStyle w:val="ListBullet"/>
+        <w:spacing w:before="20" w:after="40" w:line="276" w:lineRule="auto"/>
+      </w:pPr>
+      <w:r>
+        <w:rPr>
+          <w:rFonts w:ascii="Calibri" w:hAnsi="Calibri"/>
+          <w:color w:val="17201D"/>
+          <w:sz w:val="19"/>
+        </w:rPr>
+        <w:t>Atomic Stock Decrement: Deducts on-hand inventory via UPDATE products SET current_stock = current_stock - $1 WHERE id = $2.</w:t>
+      </w:r>
+    </w:p>
+    <w:p>
+      <w:pPr>
+        <w:pStyle w:val="ListBullet"/>
+        <w:spacing w:before="20" w:after="40" w:line="276" w:lineRule="auto"/>
+      </w:pPr>
+      <w:r>
+        <w:rPr>
+          <w:rFonts w:ascii="Calibri" w:hAnsi="Calibri"/>
+          <w:color w:val="17201D"/>
+          <w:sz w:val="19"/>
+        </w:rPr>
+        <w:t>Automatic Audit Log: Concurrently writes an OUT entry in stock_movements linked to the confirmed challan number.</w:t>
+      </w:r>
+    </w:p>
+    <w:p>
+      <w:pPr>
+        <w:pStyle w:val="ListBullet"/>
+        <w:spacing w:before="20" w:after="40" w:line="276" w:lineRule="auto"/>
+      </w:pPr>
+      <w:r>
+        <w:rPr>
+          <w:rFonts w:ascii="Calibri" w:hAnsi="Calibri"/>
+          <w:color w:val="17201D"/>
+          <w:sz w:val="19"/>
+        </w:rPr>
+        <w:t>Atomic COMMIT commits all updates together, ensuring no partial or corrupted states.</w:t>
+      </w:r>
+    </w:p>
+    <w:p>
+      <w:pPr>
+        <w:spacing w:before="160" w:after="60"/>
+        <w:jc w:val="center"/>
+      </w:pPr>
+      <w:r>
+        <w:drawing>
+          <wp:inline xmlns:a="http://schemas.openxmlformats.org/drawingml/2006/main" xmlns:pic="http://schemas.openxmlformats.org/drawingml/2006/picture">
+            <wp:extent cx="5669280" cy="2865340"/>
+            <wp:docPr id="3" name="Picture 3"/>
+            <wp:cNvGraphicFramePr>
+              <a:graphicFrameLocks noChangeAspect="1"/>
+            </wp:cNvGraphicFramePr>
+            <a:graphic>
+              <a:graphicData uri="http://schemas.openxmlformats.org/drawingml/2006/picture">
+                <pic:pic>
+                  <pic:nvPicPr>
+                    <pic:cNvPr id="0" name="transaction_concurrency_flow.png"/>
+                    <pic:cNvPicPr/>
+                  </pic:nvPicPr>
+                  <pic:blipFill>
+                    <a:blip r:embed="rId11"/>
+                    <a:stretch>
+                      <a:fillRect/>
+                    </a:stretch>
+                  </pic:blipFill>
+                  <pic:spPr>
+                    <a:xfrm>
+                      <a:off x="0" y="0"/>
+                      <a:ext cx="5669280" cy="2865340"/>
+                    </a:xfrm>
+                    <a:prstGeom prst="rect"/>
+                  </pic:spPr>
+                </pic:pic>
+              </a:graphicData>
+            </a:graphic>
+          </wp:inline>
+        </w:drawing>
+      </w:r>
+    </w:p>
+    <w:p>
+      <w:pPr>
+        <w:spacing w:before="0" w:after="200"/>
+        <w:jc w:val="center"/>
+      </w:pPr>
+      <w:r>
+        <w:rPr>
+          <w:rFonts w:ascii="Calibri" w:hAnsi="Calibri"/>
+          <w:b/>
+          <w:i/>
+          <w:color w:val="64746D"/>
+          <w:sz w:val="18"/>
+        </w:rPr>
+        <w:t>Figure 3: Five-Step Atomic Transaction Workflow with PostgreSQL Row-Level Locking (FOR UPDATE)</w:t>
+      </w:r>
+    </w:p>
+    <w:p>
+      <w:pPr>
+        <w:keepNext/>
+        <w:spacing w:before="280" w:after="100"/>
+      </w:pPr>
+      <w:r>
+        <w:rPr>
+          <w:rFonts w:ascii="Calibri" w:hAnsi="Calibri"/>
+          <w:b/>
+          <w:color w:val="102A22"/>
+          <w:sz w:val="30"/>
+        </w:rPr>
+        <w:t>5. Role-Based Access Control: Admin vs. Staff Experience</w:t>
+      </w:r>
+    </w:p>
+    <w:p>
+      <w:pPr>
+        <w:spacing w:before="40" w:after="80" w:line="276" w:lineRule="auto"/>
+      </w:pPr>
+      <w:r>
+        <w:rPr>
+          <w:rFonts w:ascii="Calibri" w:hAnsi="Calibri"/>
+          <w:color w:val="17201D"/>
+          <w:sz w:val="20"/>
+        </w:rPr>
+        <w:t>Per the prompt instructions, distinct workspaces and portals were engineered for Executive Administrators versus Department Staff:</w:t>
+      </w:r>
+    </w:p>
+    <w:p>
+      <w:pPr>
+        <w:keepNext/>
+        <w:spacing w:before="200" w:after="60"/>
+      </w:pPr>
+      <w:r>
+        <w:rPr>
+          <w:rFonts w:ascii="Calibri" w:hAnsi="Calibri"/>
+          <w:b/>
+          <w:color w:val="196F50"/>
+          <w:sz w:val="25"/>
+        </w:rPr>
+        <w:t>A. Login Page Role Separation</w:t>
+      </w:r>
+    </w:p>
+    <w:p>
+      <w:pPr>
+        <w:spacing w:before="40" w:after="80" w:line="276" w:lineRule="auto"/>
+      </w:pPr>
+      <w:r>
+        <w:rPr>
+          <w:rFonts w:ascii="Calibri" w:hAnsi="Calibri"/>
+          <w:color w:val="17201D"/>
+          <w:sz w:val="20"/>
+        </w:rPr>
+        <w:t>The sign-in interface features a Tabbed Entrance separating the Admin Portal from the Staff Workspace. Administrators enter through the purple Executive Portal, while staff select their respective department. One-click demo login buttons and a password visibility toggle (Eye icon) allow instant testing.</w:t>
+      </w:r>
+    </w:p>
+    <w:p>
+      <w:pPr>
+        <w:keepNext/>
+        <w:spacing w:before="200" w:after="60"/>
+      </w:pPr>
+      <w:r>
+        <w:rPr>
+          <w:rFonts w:ascii="Calibri" w:hAnsi="Calibri"/>
+          <w:b/>
+          <w:color w:val="196F50"/>
+          <w:sz w:val="25"/>
+        </w:rPr>
+        <w:t>B. Executive Admin Portal Experience</w:t>
+      </w:r>
+    </w:p>
+    <w:p>
+      <w:pPr>
+        <w:spacing w:before="40" w:after="80" w:line="276" w:lineRule="auto"/>
+      </w:pPr>
+      <w:r>
+        <w:rPr>
+          <w:rFonts w:ascii="Calibri" w:hAnsi="Calibri"/>
+          <w:color w:val="17201D"/>
+          <w:sz w:val="20"/>
+        </w:rPr>
+        <w:t>When logging in as Admin (admin@fundsroom.local):</w:t>
+      </w:r>
+    </w:p>
+    <w:p>
+      <w:pPr>
+        <w:pStyle w:val="ListBullet"/>
+        <w:spacing w:before="20" w:after="40" w:line="276" w:lineRule="auto"/>
+      </w:pPr>
+      <w:r>
+        <w:rPr>
+          <w:rFonts w:ascii="Calibri" w:hAnsi="Calibri"/>
+          <w:color w:val="17201D"/>
+          <w:sz w:val="19"/>
+        </w:rPr>
+        <w:t>Executive Command Center: Dashboard displaying high-level operational health, inventory asset value, live low-stock warnings, and recent dispatches.</w:t>
+      </w:r>
+    </w:p>
+    <w:p>
+      <w:pPr>
+        <w:pStyle w:val="ListBullet"/>
+        <w:spacing w:before="20" w:after="40" w:line="276" w:lineRule="auto"/>
+      </w:pPr>
+      <w:r>
+        <w:rPr>
+          <w:rFonts w:ascii="Calibri" w:hAnsi="Calibri"/>
+          <w:color w:val="17201D"/>
+          <w:sz w:val="19"/>
+        </w:rPr>
+        <w:t>Exclusive 'Team &amp; Roles' Governance (/admin/users): Administrators have exclusive access to view all registered employees and dynamically reassign or promote roles (Admin, Sales, Warehouse, Accounts) via dropdowns.</w:t>
+      </w:r>
+    </w:p>
+    <w:p>
+      <w:pPr>
+        <w:pStyle w:val="ListBullet"/>
+        <w:spacing w:before="20" w:after="40" w:line="276" w:lineRule="auto"/>
+      </w:pPr>
+      <w:r>
+        <w:rPr>
+          <w:rFonts w:ascii="Calibri" w:hAnsi="Calibri"/>
+          <w:color w:val="17201D"/>
+          <w:sz w:val="19"/>
+        </w:rPr>
+        <w:t>Unrestricted Access: Admin can perform all operations across CRM, Catalog, Restock, Dispatches, and Auditing.</w:t>
+      </w:r>
+    </w:p>
+    <w:p>
+      <w:pPr>
+        <w:keepNext/>
+        <w:spacing w:before="200" w:after="60"/>
+      </w:pPr>
+      <w:r>
+        <w:rPr>
+          <w:rFonts w:ascii="Calibri" w:hAnsi="Calibri"/>
+          <w:b/>
+          <w:color w:val="196F50"/>
+          <w:sz w:val="25"/>
+        </w:rPr>
+        <w:t>C. Department Staff Workspaces (Sales, Warehouse, Accounts)</w:t>
+      </w:r>
+    </w:p>
+    <w:p>
+      <w:pPr>
+        <w:spacing w:before="40" w:after="80" w:line="276" w:lineRule="auto"/>
+      </w:pPr>
+      <w:r>
+        <w:rPr>
+          <w:rFonts w:ascii="Calibri" w:hAnsi="Calibri"/>
+          <w:color w:val="17201D"/>
+          <w:sz w:val="20"/>
+        </w:rPr>
+        <w:t>When logging in as Staff:</w:t>
+      </w:r>
+    </w:p>
+    <w:p>
+      <w:pPr>
+        <w:pStyle w:val="ListBullet"/>
+        <w:spacing w:before="20" w:after="40" w:line="276" w:lineRule="auto"/>
+      </w:pPr>
+      <w:r>
+        <w:rPr>
+          <w:rFonts w:ascii="Calibri" w:hAnsi="Calibri"/>
+          <w:color w:val="17201D"/>
+          <w:sz w:val="19"/>
+        </w:rPr>
+        <w:t>Sales (sales@fundsroom.local): Dedicated workspace for Customer CRM leads, follow-up scheduler, and multi-product Challan generation. Cannot modify warehouse stock directly.</w:t>
+      </w:r>
+    </w:p>
+    <w:p>
+      <w:pPr>
+        <w:pStyle w:val="ListBullet"/>
+        <w:spacing w:before="20" w:after="40" w:line="276" w:lineRule="auto"/>
+      </w:pPr>
+      <w:r>
+        <w:rPr>
+          <w:rFonts w:ascii="Calibri" w:hAnsi="Calibri"/>
+          <w:color w:val="17201D"/>
+          <w:sz w:val="19"/>
+        </w:rPr>
+        <w:t>Warehouse (warehouse@fundsroom.local): Dedicated logistics workspace with on-hand inventory, low-stock alerts, 1-click Quick Restock, and goods inward logs. Cannot view customer CRM.</w:t>
+      </w:r>
+    </w:p>
+    <w:p>
+      <w:pPr>
+        <w:pStyle w:val="ListBullet"/>
+        <w:spacing w:before="20" w:after="40" w:line="276" w:lineRule="auto"/>
+      </w:pPr>
+      <w:r>
+        <w:rPr>
+          <w:rFonts w:ascii="Calibri" w:hAnsi="Calibri"/>
+          <w:color w:val="17201D"/>
+          <w:sz w:val="19"/>
+        </w:rPr>
+        <w:t>Accounts (accounts@fundsroom.local): Read-only financial auditing workspace with delivery notes, GSTIN verification, and printable tax invoices.</w:t>
+      </w:r>
+    </w:p>
+    <w:p>
+      <w:pPr>
+        <w:spacing w:before="160" w:after="60"/>
+        <w:jc w:val="center"/>
+      </w:pPr>
+      <w:r>
+        <w:drawing>
+          <wp:inline xmlns:a="http://schemas.openxmlformats.org/drawingml/2006/main" xmlns:pic="http://schemas.openxmlformats.org/drawingml/2006/picture">
+            <wp:extent cx="5669280" cy="2519680"/>
+            <wp:docPr id="4" name="Picture 4"/>
+            <wp:cNvGraphicFramePr>
+              <a:graphicFrameLocks noChangeAspect="1"/>
+            </wp:cNvGraphicFramePr>
+            <a:graphic>
+              <a:graphicData uri="http://schemas.openxmlformats.org/drawingml/2006/picture">
+                <pic:pic>
+                  <pic:nvPicPr>
+                    <pic:cNvPr id="0" name="rbac_matrix.png"/>
+                    <pic:cNvPicPr/>
+                  </pic:nvPicPr>
+                  <pic:blipFill>
+                    <a:blip r:embed="rId12"/>
+                    <a:stretch>
+                      <a:fillRect/>
+                    </a:stretch>
+                  </pic:blipFill>
+                  <pic:spPr>
+                    <a:xfrm>
+                      <a:off x="0" y="0"/>
+                      <a:ext cx="5669280" cy="2519680"/>
+                    </a:xfrm>
+                    <a:prstGeom prst="rect"/>
+                  </pic:spPr>
+                </pic:pic>
+              </a:graphicData>
+            </a:graphic>
+          </wp:inline>
+        </w:drawing>
+      </w:r>
+    </w:p>
+    <w:p>
+      <w:pPr>
+        <w:spacing w:before="0" w:after="200"/>
+        <w:jc w:val="center"/>
+      </w:pPr>
+      <w:r>
+        <w:rPr>
+          <w:rFonts w:ascii="Calibri" w:hAnsi="Calibri"/>
+          <w:b/>
+          <w:i/>
+          <w:color w:val="64746D"/>
+          <w:sz w:val="18"/>
+        </w:rPr>
+        <w:t>Figure 4: Comprehensive Role-Based Access Control (RBAC) Permission Matrix across All 4 Roles</w:t>
+      </w:r>
+    </w:p>
+    <w:p>
+      <w:pPr>
+        <w:keepNext/>
+        <w:spacing w:before="280" w:after="100"/>
+      </w:pPr>
+      <w:r>
+        <w:rPr>
+          <w:rFonts w:ascii="Calibri" w:hAnsi="Calibri"/>
+          <w:b/>
+          <w:color w:val="102A22"/>
+          <w:sz w:val="30"/>
+        </w:rPr>
+        <w:t>6. Development Environment &amp; Repository Evidence</w:t>
+      </w:r>
+    </w:p>
+    <w:p>
+      <w:pPr>
+        <w:spacing w:before="40" w:after="80" w:line="276" w:lineRule="auto"/>
+      </w:pPr>
+      <w:r>
+        <w:rPr>
+          <w:rFonts w:ascii="Calibri" w:hAnsi="Calibri"/>
+          <w:color w:val="17201D"/>
+          <w:sz w:val="20"/>
+        </w:rPr>
+        <w:t>The development environment in Visual Studio Code and the official GitHub repository setup are shown below:</w:t>
+      </w:r>
+    </w:p>
+    <w:p>
+      <w:pPr>
+        <w:spacing w:before="160" w:after="60"/>
+        <w:jc w:val="center"/>
+      </w:pPr>
+      <w:r>
+        <w:drawing>
+          <wp:inline xmlns:a="http://schemas.openxmlformats.org/drawingml/2006/main" xmlns:pic="http://schemas.openxmlformats.org/drawingml/2006/picture">
+            <wp:extent cx="5303520" cy="2983230"/>
+            <wp:docPr id="5" name="Picture 5"/>
+            <wp:cNvGraphicFramePr>
+              <a:graphicFrameLocks noChangeAspect="1"/>
+            </wp:cNvGraphicFramePr>
+            <a:graphic>
+              <a:graphicData uri="http://schemas.openxmlformats.org/drawingml/2006/picture">
+                <pic:pic>
+                  <pic:nvPicPr>
+                    <pic:cNvPr id="0" name="vscode_workspace.png"/>
+                    <pic:cNvPicPr/>
+                  </pic:nvPicPr>
+                  <pic:blipFill>
+                    <a:blip r:embed="rId13"/>
+                    <a:stretch>
+                      <a:fillRect/>
+                    </a:stretch>
+                  </pic:blipFill>
+                  <pic:spPr>
+                    <a:xfrm>
+                      <a:off x="0" y="0"/>
+                      <a:ext cx="5303520" cy="2983230"/>
+                    </a:xfrm>
+                    <a:prstGeom prst="rect"/>
+                  </pic:spPr>
+                </pic:pic>
+              </a:graphicData>
+            </a:graphic>
+          </wp:inline>
+        </w:drawing>
+      </w:r>
+    </w:p>
+    <w:p>
+      <w:pPr>
+        <w:spacing w:before="0" w:after="200"/>
+        <w:jc w:val="center"/>
+      </w:pPr>
+      <w:r>
+        <w:rPr>
+          <w:rFonts w:ascii="Calibri" w:hAnsi="Calibri"/>
+          <w:b/>
+          <w:i/>
+          <w:color w:val="64746D"/>
+          <w:sz w:val="18"/>
+        </w:rPr>
+        <w:t>Figure 5: Local VS Code Workspace with Neon PostgreSQL Active Database Configuration (.env) &amp; Monorepo Structure</w:t>
+      </w:r>
+    </w:p>
+    <w:p>
+      <w:pPr>
+        <w:spacing w:before="160" w:after="60"/>
+        <w:jc w:val="center"/>
+      </w:pPr>
+      <w:r>
+        <w:drawing>
+          <wp:inline xmlns:a="http://schemas.openxmlformats.org/drawingml/2006/main" xmlns:pic="http://schemas.openxmlformats.org/drawingml/2006/picture">
+            <wp:extent cx="5303520" cy="2983230"/>
+            <wp:docPr id="6" name="Picture 6"/>
+            <wp:cNvGraphicFramePr>
+              <a:graphicFrameLocks noChangeAspect="1"/>
+            </wp:cNvGraphicFramePr>
+            <a:graphic>
+              <a:graphicData uri="http://schemas.openxmlformats.org/drawingml/2006/picture">
+                <pic:pic>
+                  <pic:nvPicPr>
+                    <pic:cNvPr id="0" name="github_repo.png"/>
+                    <pic:cNvPicPr/>
+                  </pic:nvPicPr>
+                  <pic:blipFill>
+                    <a:blip r:embed="rId14"/>
+                    <a:stretch>
+                      <a:fillRect/>
+                    </a:stretch>
+                  </pic:blipFill>
+                  <pic:spPr>
+                    <a:xfrm>
+                      <a:off x="0" y="0"/>
+                      <a:ext cx="5303520" cy="2983230"/>
+                    </a:xfrm>
+                    <a:prstGeom prst="rect"/>
+                  </pic:spPr>
+                </pic:pic>
+              </a:graphicData>
+            </a:graphic>
+          </wp:inline>
+        </w:drawing>
+      </w:r>
+    </w:p>
+    <w:p>
+      <w:pPr>
+        <w:spacing w:before="0" w:after="200"/>
+        <w:jc w:val="center"/>
+      </w:pPr>
+      <w:r>
+        <w:rPr>
+          <w:rFonts w:ascii="Calibri" w:hAnsi="Calibri"/>
+          <w:b/>
+          <w:i/>
+          <w:color w:val="64746D"/>
+          <w:sz w:val="18"/>
+        </w:rPr>
+        <w:t>Figure 6: Official GitHub Repository Creation for fundsroom-mini-erp-crm (maheshbk1805-web)</w:t>
+      </w:r>
+    </w:p>
+    <w:p>
+      <w:pPr>
+        <w:keepNext/>
+        <w:spacing w:before="280" w:after="100"/>
+      </w:pPr>
+      <w:r>
+        <w:rPr>
+          <w:rFonts w:ascii="Calibri" w:hAnsi="Calibri"/>
+          <w:b/>
+          <w:color w:val="102A22"/>
+          <w:sz w:val="30"/>
+        </w:rPr>
+        <w:t>7. Verified Test Login Credentials</w:t>
+      </w:r>
+    </w:p>
+    <w:p>
+      <w:pPr>
+        <w:spacing w:before="40" w:after="80" w:line="276" w:lineRule="auto"/>
+      </w:pPr>
+      <w:r>
+        <w:rPr>
+          <w:rFonts w:ascii="Calibri" w:hAnsi="Calibri"/>
+          <w:color w:val="17201D"/>
+          <w:sz w:val="20"/>
+        </w:rPr>
+        <w:t xml:space="preserve">All accounts are pre-seeded in the Neon Cloud database with password: </w:t>
+      </w:r>
+    </w:p>
+    <w:p>
+      <w:r>
+        <w:rPr>
+          <w:b/>
+          <w:color w:val="196F50"/>
+          <w:sz w:val="22"/>
+        </w:rPr>
+        <w:t>Universal Password: Password@123</w:t>
+      </w:r>
+    </w:p>
+    <w:tbl>
+      <w:tblPr>
+        <w:tblW w:type="auto" w:w="0"/>
+        <w:jc w:val="center"/>
+        <w:tblLook w:firstColumn="1" w:firstRow="1" w:lastColumn="0" w:lastRow="0" w:noHBand="0" w:noVBand="1" w:val="04A0"/>
+      </w:tblPr>
+      <w:tblGrid>
+        <w:gridCol w:w="2520"/>
+        <w:gridCol w:w="2520"/>
+        <w:gridCol w:w="2520"/>
+        <w:gridCol w:w="2520"/>
+      </w:tblGrid>
+      <w:tr>
+        <w:tc>
+          <w:tcPr>
+            <w:tcW w:type="dxa" w:w="2520"/>
+            <w:shd w:fill="196F50"/>
+          </w:tcPr>
+          <w:p>
+            <w:r>
+              <w:t>Role</w:t>
+            </w:r>
+          </w:p>
+        </w:tc>
+        <w:tc>
+          <w:tcPr>
+            <w:tcW w:type="dxa" w:w="2520"/>
+            <w:shd w:fill="196F50"/>
+          </w:tcPr>
+          <w:p>
+            <w:r>
+              <w:t>Login Email</w:t>
+            </w:r>
+          </w:p>
+        </w:tc>
+        <w:tc>
+          <w:tcPr>
+            <w:tcW w:type="dxa" w:w="2520"/>
+            <w:shd w:fill="196F50"/>
+          </w:tcPr>
+          <w:p>
+            <w:r>
+              <w:t>Password</w:t>
+            </w:r>
+          </w:p>
+        </w:tc>
+        <w:tc>
+          <w:tcPr>
+            <w:tcW w:type="dxa" w:w="2520"/>
+            <w:shd w:fill="196F50"/>
+          </w:tcPr>
+          <w:p>
+            <w:r>
+              <w:t>Workspace Access Scope</w:t>
+            </w:r>
+          </w:p>
+        </w:tc>
+      </w:tr>
+      <w:tr>
+        <w:tc>
+          <w:tcPr>
+            <w:tcW w:type="dxa" w:w="2520"/>
+          </w:tcPr>
+          <w:p>
+            <w:r>
+              <w:rPr>
+                <w:b/>
+                <w:color w:val="17201D"/>
+                <w:sz w:val="17"/>
+              </w:rPr>
+              <w:t>Admin</w:t>
+            </w:r>
+          </w:p>
+        </w:tc>
+        <w:tc>
+          <w:tcPr>
+            <w:tcW w:type="dxa" w:w="2520"/>
+          </w:tcPr>
+          <w:p>
+            <w:r>
+              <w:rPr>
+                <w:color w:val="17201D"/>
+                <w:sz w:val="17"/>
+              </w:rPr>
+              <w:t>admin@fundsroom.local</w:t>
+            </w:r>
+          </w:p>
+        </w:tc>
+        <w:tc>
+          <w:tcPr>
+            <w:tcW w:type="dxa" w:w="2520"/>
+          </w:tcPr>
+          <w:p>
+            <w:r>
+              <w:rPr>
+                <w:color w:val="17201D"/>
+                <w:sz w:val="17"/>
+              </w:rPr>
+              <w:t>Password@123</w:t>
+            </w:r>
+          </w:p>
+        </w:tc>
+        <w:tc>
+          <w:tcPr>
+            <w:tcW w:type="dxa" w:w="2520"/>
+          </w:tcPr>
+          <w:p>
+            <w:r>
+              <w:rPr>
+                <w:color w:val="17201D"/>
+                <w:sz w:val="17"/>
+              </w:rPr>
+              <w:t>Executive full access: CRM, Inventory, Orders, Audit logs, and exclusive User Role Governance.</w:t>
+            </w:r>
+          </w:p>
+        </w:tc>
+      </w:tr>
+      <w:tr>
+        <w:tc>
+          <w:tcPr>
+            <w:tcW w:type="dxa" w:w="2520"/>
+          </w:tcPr>
+          <w:p>
+            <w:r>
+              <w:rPr>
+                <w:b/>
+                <w:color w:val="17201D"/>
+                <w:sz w:val="17"/>
+              </w:rPr>
+              <w:t>Sales</w:t>
+            </w:r>
+          </w:p>
+        </w:tc>
+        <w:tc>
+          <w:tcPr>
+            <w:tcW w:type="dxa" w:w="2520"/>
+          </w:tcPr>
+          <w:p>
+            <w:r>
+              <w:rPr>
+                <w:color w:val="17201D"/>
+                <w:sz w:val="17"/>
+              </w:rPr>
+              <w:t>sales@fundsroom.local</w:t>
+            </w:r>
+          </w:p>
+        </w:tc>
+        <w:tc>
+          <w:tcPr>
+            <w:tcW w:type="dxa" w:w="2520"/>
+          </w:tcPr>
+          <w:p>
+            <w:r>
+              <w:rPr>
+                <w:color w:val="17201D"/>
+                <w:sz w:val="17"/>
+              </w:rPr>
+              <w:t>Password@123</w:t>
+            </w:r>
+          </w:p>
+        </w:tc>
+        <w:tc>
+          <w:tcPr>
+            <w:tcW w:type="dxa" w:w="2520"/>
+          </w:tcPr>
+          <w:p>
+            <w:r>
+              <w:rPr>
+                <w:color w:val="17201D"/>
+                <w:sz w:val="17"/>
+              </w:rPr>
+              <w:t>Sales domain: Register clients, log follow-ups, draft and confirm multi-item delivery challans.</w:t>
+            </w:r>
+          </w:p>
+        </w:tc>
+      </w:tr>
+      <w:tr>
+        <w:tc>
+          <w:tcPr>
+            <w:tcW w:type="dxa" w:w="2520"/>
+          </w:tcPr>
+          <w:p>
+            <w:r>
+              <w:rPr>
+                <w:b/>
+                <w:color w:val="17201D"/>
+                <w:sz w:val="17"/>
+              </w:rPr>
+              <w:t>Warehouse</w:t>
+            </w:r>
+          </w:p>
+        </w:tc>
+        <w:tc>
+          <w:tcPr>
+            <w:tcW w:type="dxa" w:w="2520"/>
+          </w:tcPr>
+          <w:p>
+            <w:r>
+              <w:rPr>
+                <w:color w:val="17201D"/>
+                <w:sz w:val="17"/>
+              </w:rPr>
+              <w:t>warehouse@fundsroom.local</w:t>
+            </w:r>
+          </w:p>
+        </w:tc>
+        <w:tc>
+          <w:tcPr>
+            <w:tcW w:type="dxa" w:w="2520"/>
+          </w:tcPr>
+          <w:p>
+            <w:r>
+              <w:rPr>
+                <w:color w:val="17201D"/>
+                <w:sz w:val="17"/>
+              </w:rPr>
+              <w:t>Password@123</w:t>
+            </w:r>
+          </w:p>
+        </w:tc>
+        <w:tc>
+          <w:tcPr>
+            <w:tcW w:type="dxa" w:w="2520"/>
+          </w:tcPr>
+          <w:p>
+            <w:r>
+              <w:rPr>
+                <w:color w:val="17201D"/>
+                <w:sz w:val="17"/>
+              </w:rPr>
+              <w:t>Logistics domain: Manage catalog products, set reorder alert thresholds, 1-click Quick Restock.</w:t>
+            </w:r>
+          </w:p>
+        </w:tc>
+      </w:tr>
+      <w:tr>
+        <w:tc>
+          <w:tcPr>
+            <w:tcW w:type="dxa" w:w="2520"/>
+          </w:tcPr>
+          <w:p>
+            <w:r>
+              <w:rPr>
+                <w:b/>
+                <w:color w:val="17201D"/>
+                <w:sz w:val="17"/>
+              </w:rPr>
+              <w:t>Accounts</w:t>
+            </w:r>
+          </w:p>
+        </w:tc>
+        <w:tc>
+          <w:tcPr>
+            <w:tcW w:type="dxa" w:w="2520"/>
+          </w:tcPr>
+          <w:p>
+            <w:r>
+              <w:rPr>
+                <w:color w:val="17201D"/>
+                <w:sz w:val="17"/>
+              </w:rPr>
+              <w:t>accounts@fundsroom.local</w:t>
+            </w:r>
+          </w:p>
+        </w:tc>
+        <w:tc>
+          <w:tcPr>
+            <w:tcW w:type="dxa" w:w="2520"/>
+          </w:tcPr>
+          <w:p>
+            <w:r>
+              <w:rPr>
+                <w:color w:val="17201D"/>
+                <w:sz w:val="17"/>
+              </w:rPr>
+              <w:t>Password@123</w:t>
+            </w:r>
+          </w:p>
+        </w:tc>
+        <w:tc>
+          <w:tcPr>
+            <w:tcW w:type="dxa" w:w="2520"/>
+          </w:tcPr>
+          <w:p>
+            <w:r>
+              <w:rPr>
+                <w:color w:val="17201D"/>
+                <w:sz w:val="17"/>
+              </w:rPr>
+              <w:t>Auditing domain: Read-only operational visibility across all records and printable delivery invoices.</w:t>
+            </w:r>
+          </w:p>
+        </w:tc>
+      </w:tr>
+    </w:tbl>
+    <w:p>
+      <w:pPr>
+        <w:keepNext/>
+        <w:spacing w:before="280" w:after="100"/>
+      </w:pPr>
+      <w:r>
+        <w:rPr>
+          <w:rFonts w:ascii="Calibri" w:hAnsi="Calibri"/>
+          <w:b/>
+          <w:color w:val="102A22"/>
+          <w:sz w:val="30"/>
+        </w:rPr>
+        <w:t>8. Screen Recording &amp; Google Form Submission Checklist</w:t>
+      </w:r>
+    </w:p>
+    <w:p>
+      <w:pPr>
+        <w:spacing w:before="40" w:after="80" w:line="276" w:lineRule="auto"/>
+      </w:pPr>
+      <w:r>
+        <w:rPr>
+          <w:rFonts w:ascii="Calibri" w:hAnsi="Calibri"/>
+          <w:color w:val="17201D"/>
+          <w:sz w:val="20"/>
+        </w:rPr>
+        <w:t>Per the case study instructions, follow this exact procedure for the submission:</w:t>
       </w:r>
     </w:p>
     <w:p>
@@ -1424,17 +2016,17 @@
           <w:rFonts w:ascii="Calibri" w:hAnsi="Calibri"/>
           <w:b/>
           <w:color w:val="17201D"/>
-          <w:sz w:val="20"/>
+          <w:sz w:val="19"/>
         </w:rPr>
-        <w:t xml:space="preserve">3. Follow-up Flow: </w:t>
+        <w:t xml:space="preserve">1. Screen Recording: </w:t>
       </w:r>
       <w:r>
         <w:rPr>
           <w:rFonts w:ascii="Calibri" w:hAnsi="Calibri"/>
           <w:color w:val="17201D"/>
-          <w:sz w:val="20"/>
+          <w:sz w:val="19"/>
         </w:rPr>
-        <w:t>Demonstrate customer detail view and logging a follow-up note with new date.</w:t>
+        <w:t>Start your screen recorder (Windows Game Bar [Win + G], OBS Studio, or Loom).</w:t>
       </w:r>
     </w:p>
     <w:p>
@@ -1447,17 +2039,17 @@
           <w:rFonts w:ascii="Calibri" w:hAnsi="Calibri"/>
           <w:b/>
           <w:color w:val="17201D"/>
-          <w:sz w:val="20"/>
+          <w:sz w:val="19"/>
         </w:rPr>
-        <w:t xml:space="preserve">4. Inventory Flow: </w:t>
+        <w:t xml:space="preserve">2. Admin Flow: </w:t>
       </w:r>
       <w:r>
         <w:rPr>
           <w:rFonts w:ascii="Calibri" w:hAnsi="Calibri"/>
           <w:color w:val="17201D"/>
-          <w:sz w:val="20"/>
+          <w:sz w:val="19"/>
         </w:rPr>
-        <w:t>Demonstrate product catalog, low stock indicator, and editing a product.</w:t>
+        <w:t>Demonstrate Admin login, Executive Command Center metrics, and the User Management page.</w:t>
       </w:r>
     </w:p>
     <w:p>
@@ -1470,17 +2062,17 @@
           <w:rFonts w:ascii="Calibri" w:hAnsi="Calibri"/>
           <w:b/>
           <w:color w:val="17201D"/>
-          <w:sz w:val="20"/>
+          <w:sz w:val="19"/>
         </w:rPr>
-        <w:t xml:space="preserve">5. Challan Flow: </w:t>
+        <w:t xml:space="preserve">3. CRM Flow: </w:t>
       </w:r>
       <w:r>
         <w:rPr>
           <w:rFonts w:ascii="Calibri" w:hAnsi="Calibri"/>
           <w:color w:val="17201D"/>
-          <w:sz w:val="20"/>
+          <w:sz w:val="19"/>
         </w:rPr>
-        <w:t>Create a multi-product Sales Challan as Draft, view its details, and confirm it.</w:t>
+        <w:t>Go to Customer CRM &amp;rarr; Add customer with GSTIN &amp;rarr; Open Profile &amp;rarr; Log a follow-up note.</w:t>
       </w:r>
     </w:p>
     <w:p>
@@ -1493,17 +2085,17 @@
           <w:rFonts w:ascii="Calibri" w:hAnsi="Calibri"/>
           <w:b/>
           <w:color w:val="17201D"/>
-          <w:sz w:val="20"/>
+          <w:sz w:val="19"/>
         </w:rPr>
-        <w:t xml:space="preserve">6. Stock Verification: </w:t>
+        <w:t xml:space="preserve">4. Inventory Flow: </w:t>
       </w:r>
       <w:r>
         <w:rPr>
           <w:rFonts w:ascii="Calibri" w:hAnsi="Calibri"/>
           <w:color w:val="17201D"/>
-          <w:sz w:val="20"/>
+          <w:sz w:val="19"/>
         </w:rPr>
-        <w:t>Demonstrate that stock was decremented and an OUT movement was created in the Audit log.</w:t>
+        <w:t>Go to Inventory &amp;rarr; Show low-stock alert badge &amp;rarr; Click '+ Restock' to inward goods in 1 click.</w:t>
       </w:r>
     </w:p>
     <w:p>
@@ -1516,17 +2108,17 @@
           <w:rFonts w:ascii="Calibri" w:hAnsi="Calibri"/>
           <w:b/>
           <w:color w:val="17201D"/>
-          <w:sz w:val="20"/>
+          <w:sz w:val="19"/>
         </w:rPr>
-        <w:t xml:space="preserve">7. PDF Export: </w:t>
+        <w:t xml:space="preserve">5. Challan Flow: </w:t>
       </w:r>
       <w:r>
         <w:rPr>
           <w:rFonts w:ascii="Calibri" w:hAnsi="Calibri"/>
           <w:color w:val="17201D"/>
-          <w:sz w:val="20"/>
+          <w:sz w:val="19"/>
         </w:rPr>
-        <w:t>Click 'Print / Export PDF' to demonstrate the delivery note invoice.</w:t>
+        <w:t>Go to Sales Challans &amp;rarr; Click 'New Challan' &amp;rarr; Add multiple products &amp;rarr; Create Confirmed &amp;rarr; Show printable Tax Invoice.</w:t>
       </w:r>
     </w:p>
     <w:p>
@@ -1539,17 +2131,17 @@
           <w:rFonts w:ascii="Calibri" w:hAnsi="Calibri"/>
           <w:b/>
           <w:color w:val="17201D"/>
-          <w:sz w:val="20"/>
+          <w:sz w:val="19"/>
         </w:rPr>
-        <w:t xml:space="preserve">8. Drive Upload: </w:t>
+        <w:t xml:space="preserve">6. Audit Log: </w:t>
       </w:r>
       <w:r>
         <w:rPr>
           <w:rFonts w:ascii="Calibri" w:hAnsi="Calibri"/>
           <w:color w:val="17201D"/>
-          <w:sz w:val="20"/>
+          <w:sz w:val="19"/>
         </w:rPr>
-        <w:t>Upload recording to Google Drive (set permission to 'Anyone with the link can view').</w:t>
+        <w:t>Go to Stock Audit Log &amp;rarr; Show the automated OUT movement logged for the confirmed challan.</w:t>
       </w:r>
     </w:p>
     <w:p>
@@ -1562,7 +2154,53 @@
           <w:rFonts w:ascii="Calibri" w:hAnsi="Calibri"/>
           <w:b/>
           <w:color w:val="17201D"/>
-          <w:sz w:val="20"/>
+          <w:sz w:val="19"/>
+        </w:rPr>
+        <w:t xml:space="preserve">7. Role Switching: </w:t>
+      </w:r>
+      <w:r>
+        <w:rPr>
+          <w:rFonts w:ascii="Calibri" w:hAnsi="Calibri"/>
+          <w:color w:val="17201D"/>
+          <w:sz w:val="19"/>
+        </w:rPr>
+        <w:t>Sign out &amp;rarr; Log in as Sales or Accounts to showcase the tailored role workspace.</w:t>
+      </w:r>
+    </w:p>
+    <w:p>
+      <w:pPr>
+        <w:pStyle w:val="ListBullet"/>
+        <w:spacing w:before="20" w:after="40" w:line="276" w:lineRule="auto"/>
+      </w:pPr>
+      <w:r>
+        <w:rPr>
+          <w:rFonts w:ascii="Calibri" w:hAnsi="Calibri"/>
+          <w:b/>
+          <w:color w:val="17201D"/>
+          <w:sz w:val="19"/>
+        </w:rPr>
+        <w:t xml:space="preserve">8. Drive Upload: </w:t>
+      </w:r>
+      <w:r>
+        <w:rPr>
+          <w:rFonts w:ascii="Calibri" w:hAnsi="Calibri"/>
+          <w:color w:val="17201D"/>
+          <w:sz w:val="19"/>
+        </w:rPr>
+        <w:t>Upload your video recording to Google Drive. Right-click &amp;rarr; Share &amp;rarr; Set General Access to 'Anyone with the link can view'.</w:t>
+      </w:r>
+    </w:p>
+    <w:p>
+      <w:pPr>
+        <w:pStyle w:val="ListBullet"/>
+        <w:spacing w:before="20" w:after="40" w:line="276" w:lineRule="auto"/>
+      </w:pPr>
+      <w:r>
+        <w:rPr>
+          <w:rFonts w:ascii="Calibri" w:hAnsi="Calibri"/>
+          <w:b/>
+          <w:color w:val="17201D"/>
+          <w:sz w:val="19"/>
         </w:rPr>
         <w:t xml:space="preserve">9. Form Submission: </w:t>
       </w:r>
@@ -1570,24 +2208,24 @@
         <w:rPr>
           <w:rFonts w:ascii="Calibri" w:hAnsi="Calibri"/>
           <w:color w:val="17201D"/>
-          <w:sz w:val="20"/>
+          <w:sz w:val="19"/>
         </w:rPr>
-        <w:t>Submit the Google Form before 6:00 PM tomorrow with PDF solution &amp; Drive link.</w:t>
+        <w:t>Submit the Google Form before 6:00 PM with your Drive link and this PDF document.</w:t>
       </w:r>
     </w:p>
     <w:p>
       <w:pPr>
         <w:keepNext/>
-        <w:spacing w:before="280" w:after="120"/>
+        <w:spacing w:before="280" w:after="100"/>
       </w:pPr>
       <w:r>
         <w:rPr>
           <w:rFonts w:ascii="Calibri" w:hAnsi="Calibri"/>
           <w:b/>
           <w:color w:val="102A22"/>
-          <w:sz w:val="32"/>
+          <w:sz w:val="30"/>
         </w:rPr>
-        <w:t>8. Immediate Joining Confirmation</w:t>
+        <w:t>9. Immediate Joining Commitment</w:t>
       </w:r>
     </w:p>
     <w:p>
@@ -1598,14 +2236,14 @@
         <w:rPr>
           <w:rFonts w:ascii="Calibri" w:hAnsi="Calibri"/>
           <w:color w:val="17201D"/>
-          <w:sz w:val="21"/>
+          <w:sz w:val="20"/>
         </w:rPr>
-        <w:t>I confirm my availability for immediate joining at Fundsroom in Pune, Maharashtra. I am fully comfortable with the Pune work location and look forward to contributing to Fundsroom's technology roadmap.</w:t>
+        <w:t>I, Mahesh B K, confirm my genuine interest and availability for immediate joining at Fundsroom in Pune, Maharashtra. I am fully comfortable with the Pune work location and look forward to clearing Rounds 2 and 3 and joining the organization without fail.</w:t>
       </w:r>
     </w:p>
     <w:sectPr>
       <w:pgSz w:w="12240" w:h="15840"/>
-      <w:pgMar w:top="1152" w:right="1152" w:bottom="1152" w:left="1152" w:header="720" w:footer="720" w:gutter="0"/>
+      <w:pgMar w:top="1080" w:right="1080" w:bottom="1080" w:left="1080" w:header="720" w:footer="720" w:gutter="0"/>
       <w:cols w:space="720"/>
       <w:docGrid w:linePitch="360"/>
     </w:sectPr>

</xml_diff>